<commit_message>
Update Annex 4 Curriculum Development Guidelines translation
Co-Authored-By: Claude Opus 4.6 <noreply@anthropic.com>
Claude-Session: https://claude.ai/code/session_01N9ZP28hxEfPoWHf2qaE8QM
</commit_message>
<xml_diff>
--- a/Computer Engineering, Software Engineering, Computer systems & their softwares/Annexes/Annex №4 Curriculum Development Guidelines.docx
+++ b/Computer Engineering, Software Engineering, Computer systems & their softwares/Annexes/Annex №4 Curriculum Development Guidelines.docx
@@ -131,7 +131,7 @@
                 <w:color w:val="000000"/>
                 <w:sz w:val="28"/>
               </w:rPr>
-              <w:t>15 April 2026</w:t>
+              <w:t>2026-yil 15-aprel</w:t>
             </w:r>
           </w:p>
         </w:tc>
@@ -243,7 +243,7 @@
           <w:color w:val="000000"/>
           <w:sz w:val="28"/>
         </w:rPr>
-        <w:t xml:space="preserve">In accordance with  Law   Republic  Uzbekistan “On Education,” Resolution No. PQ-200   President   Republic  Uzbekistan dated 3 July 2023 “On measures for  effective organization  state governance in  field  higher education, science and innovation within  framework  administrative reforms,” and Control Plan No. 01-16-451 dated 11 November 2025   Ministry  Higher Education, Science and Innovation for  effective implementation   “Roadmap”  proposals approved tomonidan  President   Republic  Uzbekistan and assignments given based on  presentation results on  development   science and education sector, and with  aim  improving  educational, normative and methodical documents  higher education, </w:t>
+        <w:t>O'zbekiston Respublikasining "Ta'lim to'g'risida"gi Qonuniga, O'zbekiston Respublikasi Prezidentining 2023-yil 3-iyuldagi "O'zbekiston Respublikasi Oliy ta'lim, fan va innovatsiyalar vazirligi faoliyatini samarali tashkil etish chora-tadbirlari to'g'risida"gi PQ-200-son qaroriga va O'zbekiston Respublikasi Vazirlar Mahkamasining 2022-yil 31-dekabrdagi "O'zbekiston Respublikasi oliy ta'lim muassasalari faoliyatini tashkil etish to'g'risida"gi 768-son qaroriga muvofiq</w:t>
       </w:r>
       <w:r>
         <w:rPr>
@@ -373,7 +373,7 @@
           <w:color w:val="000000"/>
           <w:sz w:val="28"/>
         </w:rPr>
-        <w:t xml:space="preserve">1. The proposals  higher education institutions on bringing  curricula and syllabuses  educational fields and specialties to a single normative document format, while optimizing m, shall be approved, with  aim  furr improving  system for developing, approving and applying  educational, normative and methodical documents  higher education to  educational process, as well as improving  quality   educational process organized on  basis   credit-module system. </w:t>
+        <w:t>1. Oliy ta'lim muassasalarining ta'lim yo'nalishlari va mutaxassisliklari o'quv dasturlari va sillabuslari yagona me'yoriy hujjat formatiga keltirilishi, shu bilan birga ularni optimallashtirish bo'yicha takliflari qo'llab-quvvatlansin.</w:t>
       </w:r>
       <w:r>
         <w:rPr>
@@ -450,7 +450,7 @@
           <w:color w:val="000000"/>
           <w:sz w:val="28"/>
         </w:rPr>
-        <w:t xml:space="preserve">2. Oliy ta'lim yo'nalishlari va mutaxassisliklari fanlari uchun o'quv dasturlarini ishlab chiqish tartibi 1-ilovaga muviq tasdiqlansin; </w:t>
+        <w:t>2. Oliy ta'lim yo'nalishlari va mutaxassisliklari fanlari uchun o'quv dasturlarini ishlab chiqish tartibi 1-ilovaga muvofiq tasdiqlansin;</w:t>
       </w:r>
       <w:r>
         <w:rPr>
@@ -482,7 +482,7 @@
           <w:color w:val="000000"/>
           <w:sz w:val="28"/>
         </w:rPr>
-        <w:t xml:space="preserve">Oliy ta'lim yo'nalishlari va mutaxassisliklari fanlari o'quv dasturining namunaviy shakli 2-ilovaga muviq tasdiqlansin. </w:t>
+        <w:t>Oliy ta'lim yo'nalishlari va mutaxassisliklari fanlari o'quv dasturining namunaviy shakli 2-ilovaga muvofiq tasdiqlansin.</w:t>
       </w:r>
       <w:r>
         <w:rPr>
@@ -511,7 +511,7 @@
           <w:color w:val="000000"/>
           <w:sz w:val="28"/>
         </w:rPr>
-        <w:t xml:space="preserve">3. Oliy ta'lim muassasalari boshqarmasi (A. Mamanazarov) va Oliy ta'limni rivojlantirish tadqiqotlari markazi (A. Xoliqov) </w:t>
+        <w:t>3. Oliy ta'lim muassasalari boshqarmasi (A. Mamanazarov) va Oliy ta'limni rivojlantirish tadqiqotlari markazi (A. Xoliqov)</w:t>
       </w:r>
       <w:r>
         <w:rPr>
@@ -559,7 +559,7 @@
           <w:color w:val="000000"/>
           <w:sz w:val="28"/>
         </w:rPr>
-        <w:t xml:space="preserve">organize training seminars tomonidan 20 May 2026 for  persons responsible for  educational-methodical activities  higher education institutions (heads  educational-methodical departments (divisions), deans, deputy deans, heads  departments, pressors) on  procedure for developing curricula. </w:t>
+        <w:t>oliy ta'lim muassasalarining o'quv-uslubiy faoliyati uchun mas'ul shaxslar (o'quv-uslubiy bo'limlar (bo'linmalar) boshliqlari) uchun oliy ta'lim yo'nalishlari va mutaxassisliklari fanlari o'quv dasturlarini ishlab chiqishning belgilangan tartibi bo'yicha 2026-yil 20-maygacha o'quv seminarlarini tashkil etsin.</w:t>
       </w:r>
       <w:r>
         <w:rPr>
@@ -606,7 +606,7 @@
           <w:color w:val="000000"/>
           <w:sz w:val="28"/>
         </w:rPr>
-        <w:t xml:space="preserve">4. Rectors  higher education institutions and directors  branches shall, starting from  2026/2027 academic year, develop curricula on  basis   established procedure and take measures to apply m to  educational process. </w:t>
+        <w:t>4. Oliy ta'lim muassasalari rektorlari va filiallar direktorlari 2026/2027-o'quv yilidan boshlab belgilangan tartib asosida o'quv dasturlarini ishlab chiqsinlar va ularning har bir o'quv yili boshlanishidan oldin tasdiqlanishini ta'minlash chora-tadbirlarini ko'rsinlar.</w:t>
       </w:r>
       <w:r>
         <w:rPr>
@@ -653,7 +653,7 @@
           <w:color w:val="000000"/>
           <w:sz w:val="28"/>
         </w:rPr>
-        <w:t xml:space="preserve">5. The standard form   o'quv dasturi and syllabus approved tomonidan Annex 2 to Order No. 259   Vazir  Higher Education, Science and Innovation dated 9 June 2023 “Oliy ta'limning me'yoriy-uslubiy hujjatlarini ishlab chiqish jarayonini takomillashtirish to'g'risida” shall be deemed to have lost its force. </w:t>
+        <w:t>5. Oliy ta'lim, fan va innovatsiyalar vazirining 2023-yil 9-iyundagi "Oliy ta'limning me'yoriy-uslubiy hujjatlarini ishlab chiqish jarayonini takomillashtirish to'g'risida"gi 259-son buyrug'ining 2-ilovasi bilan tasdiqlangan o'quv dasturi va sillabus namunaviy shakli o'z kuchini yo'qotgan deb hisoblansin.</w:t>
       </w:r>
       <w:r>
         <w:rPr>
@@ -712,7 +712,7 @@
           <w:color w:val="000000"/>
           <w:sz w:val="28"/>
         </w:rPr>
-        <w:t xml:space="preserve">6. Ushbu buyruq ijrosini nazorat qilish birinchi vazir o'rinbosari S. Radjabovga yuklatilsin. </w:t>
+        <w:t>6. Ushbu buyruq ijrosini nazorat qilish birinchi vazir o'rinbosari S. Radjabovga yuklatilsin.</w:t>
       </w:r>
       <w:r>
         <w:rPr>
@@ -744,9 +744,7 @@
           <w:color w:val="000000"/>
           <w:sz w:val="28"/>
         </w:rPr>
-        <w:t xml:space="preserve">Vazir </w:t>
-        <w:tab/>
-        <w:t>K. Sharipov</w:t>
+        <w:t>Vazir</w:t>
       </w:r>
       <w:r/>
       <w:r>
@@ -776,7 +774,7 @@
           <w:color w:val="000000"/>
           <w:sz w:val="28"/>
         </w:rPr>
-        <w:t>[Elektron raqamli imzo orqali imzolangan — Oliy ta’lim, fan va innovatsiyalar vazirligi]</w:t>
+        <w:t>[Elektron raqamli imzo orqali imzolangan — Oliy ta'lim, fan va innovatsiyalar vazirligi]</w:t>
       </w:r>
       <w:r>
         <w:rPr>
@@ -856,9 +854,7 @@
           <w:color w:val="000000"/>
           <w:sz w:val="28"/>
         </w:rPr>
-        <w:t xml:space="preserve">Annex 1 to Order No. 142   Vazir  Higher Education, Science and </w:t>
-        <w:tab/>
-        <w:t>2026-yil 15-apreldagi 142-son buyrug'iga 1-ilova</w:t>
+        <w:t>Oliy ta'lim, fan va innovatsiyalar vazirining 2026-yil 15-apreldagi 142-son buyrug'iga 1-ilova</w:t>
       </w:r>
       <w:r/>
       <w:r>
@@ -885,7 +881,7 @@
       </w:pPr>
       <w:r>
         <w:tab/>
-        <w:t xml:space="preserve">YO'RIQNOMA </w:t>
+        <w:t>YO'RIQNOMA</w:t>
         <w:br/>
         <w:t>OTM dastur o'quv rejalarini loyihalash va ishlab chiqish bo'yicha</w:t>
       </w:r>
@@ -946,7 +942,7 @@
           <w:color w:val="000000"/>
           <w:sz w:val="28"/>
         </w:rPr>
-        <w:t xml:space="preserve">1. Ushbu Procedure for developing curricula for subjects  higher education fields and specialties   developed in accordance with  Law   Republic  Uzbekistan “On Education,” Resolution No. PQ-200   President   Republic  Uzbekistan dated 3 July 2023 “On measures for  effective organization  state governance in  field  higher education, science and innovation within  framework  administrative reforms,” and Control Plan No. 01-16-451 dated 11 November 2025   Ministry  Higher Education, Science and Innovation for  effective implementation   “Roadmap”  proposals approved tomonidan  President   Republic  Uzbekistan and assignments given based on  presentation results on  development   science and education sector. </w:t>
+        <w:t>1. Oliy ta'lim yo'nalishlari va mutaxassisliklari fanlari uchun o'quv dasturlarini ishlab chiqishning ushbu Tartibi O'zbekiston Respublikasining "Ta'lim to'g'risida"gi Qonuniga, O'zbekiston Respublikasi Vazirlar Mahkamasining 2022-yil 31-dekabrdagi "O'zbekiston Respublikasi oliy ta'lim muassasalari faoliyatini tashkil etish to'g'risida"gi 768-son qaroriga va oliy ta'lim to'g'risidagi me'yoriy-huquqiy hujjatlarga muvofiq ishlab chiqilgan.</w:t>
       </w:r>
       <w:r>
         <w:rPr>
@@ -1056,7 +1052,7 @@
           <w:color w:val="000000"/>
           <w:sz w:val="28"/>
         </w:rPr>
-        <w:t xml:space="preserve">2. Ushbu Procedure for developing curricula for subjects  higher education fields and specialties (hereinafter referred to as  “Procedure”) establishes a unified procedure for developing and approving curricula for subjects  higher education fields and specialties on  basis  state educational standards, malaka talablari and curricula (study plans), as well as for ir introduction into  educational process  higher education institutions. </w:t>
+        <w:t>2. Oliy ta'lim yo'nalishlari va mutaxassisliklari fanlari uchun o'quv dasturlarini ishlab chiqishning ushbu Tartibi (bundan buyon "Tartib" deb yuritiladi) oliy ta'lim yo'nalishlari va mutaxassisliklari fanlari o'quv dasturlarini ishlab chiqish va tasdiqlashning yagona tartibini belgilaydi.</w:t>
       </w:r>
       <w:r>
         <w:rPr>
@@ -1121,7 +1117,7 @@
           <w:color w:val="000000"/>
           <w:sz w:val="28"/>
         </w:rPr>
-        <w:t xml:space="preserve">3. Tartibda quyidagi asosiy tushunchalar qo'llaniladi: </w:t>
+        <w:t>3. Tartibda quyidagi asosiy tushunchalar qo'llaniladi:</w:t>
       </w:r>
     </w:p>
     <w:p>
@@ -1141,7 +1137,7 @@
           <w:color w:val="000000"/>
           <w:sz w:val="28"/>
         </w:rPr>
-        <w:t xml:space="preserve">malaka talablari – a normative-methodical document that defines  field, objects and types  pressional activity  a bachelor’s or master’s degree graduate  a higher education institution,  requirements for ir pressional competencies, ir specialty (qualification), as well as  catalogue  o'quv fanis serving to form se competencies; </w:t>
+        <w:t>malaka talablari – oliy ta'lim muassasasi bakalavriat yoki magistratura bitiruvchisining kasbiy faoliyat sohasi, ob'ektlari va turlarini, shuningdek ular egallab olishi kerak bo'lgan bilim, ko'nikma va kompetensiyalarga qo'yiladigan talablarni belgilovchi me'yoriy-uslubiy hujjat;</w:t>
       </w:r>
       <w:r>
         <w:rPr>
@@ -1197,7 +1193,7 @@
           <w:color w:val="000000"/>
           <w:sz w:val="28"/>
         </w:rPr>
-        <w:t xml:space="preserve">o'quv rejasi – a normative-methodical document that defines, for  entire period  study,  types  educational activity,  composition  o'quv fanis and courses,  sequence  ir study, and ir volume in soat and credits for a specific bachelor’s educational field or master’s specialty  higher education; </w:t>
+        <w:t>o'quv rejasi – butun o'qish davri uchun ta'lim faoliyati turlarini, o'quv fanlari va kurslar tarkibini, ularni o'rganish ketma-ketligi va jadvalini, ta'lim mashg'ulotlari shakllarini, ta'lim natijalarini baholash usullari va vositalarini, shuningdek har bir fan uchun soatlar taqsimotini, shu jumladan auditoriya mashg'ulotlari va mustaqil ta'limni belgilovchi me'yoriy-uslubiy hujjat;</w:t>
       </w:r>
       <w:r>
         <w:rPr>
@@ -1272,7 +1268,7 @@
           <w:color w:val="000000"/>
           <w:sz w:val="28"/>
         </w:rPr>
-        <w:t xml:space="preserve">o'quv fani – a component   o'quv dasturi designated for mastery in a specific educational field and specialty, constituting  content  education; a systematized scientific-methodical complex embodying  knowledge, skills and competencies that a student is required to acquire; </w:t>
+        <w:t>o'quv fani – muayyan ta'lim yo'nalishi va mutaxassislikda o'zlashtirishga mo'ljallangan o'quv rejasining tarkibiy qismi bo'lib, ta'lim mazmunini tashkil etadi; maqsad, hajm va murakkablik darajasi bilan belgilangan bilim, ko'nikma va kompetensiyalarning mantiqiy bog'langan tizimini o'z ichiga olgan tizimlashtirilgan ilmiy-uslubiy majmua;</w:t>
       </w:r>
       <w:r>
         <w:rPr>
@@ -1319,7 +1315,7 @@
           <w:color w:val="000000"/>
           <w:sz w:val="28"/>
         </w:rPr>
-        <w:t xml:space="preserve">o'quv dasturi (sillabus/dastur) – a normative-methodical document indicating  main topics, content, optimal methods  mastery, types  classes and information sources  an o'quv fani that determine  content  education; </w:t>
+        <w:t>o'quv dasturi (sillabus/dastur) – o'quv fani doirasida shakllantirilishi kerak bo'lgan bilim, ko'nikma va kompetensiyalarni, ya'ni o'quv natijalarini belgilovchi o'quv fanining asosiy mavzulari, mazmuni, o'zlashtirishning optimal usullari, mashg'ulot turlari va axborot manbalarini ko'rsatuvchi me'yoriy-uslubiy hujjat;</w:t>
       </w:r>
       <w:r>
         <w:rPr>
@@ -1366,7 +1362,7 @@
           <w:color w:val="000000"/>
           <w:sz w:val="28"/>
         </w:rPr>
-        <w:t xml:space="preserve">fan (modul) rahbari – a pressor/teacher appointed tomonidan  department, who develops  o'quv dasturi for a specific subject in cooperation with or pressors/teachers. They also coordinate  prepared educational content (lecture texts, laboratory, practical and seminar classes, methodical guidelines and manuals for independent study, presentations, video and audio lessons). </w:t>
+        <w:t>fan (modul) rahbari – kafedra tomonidan tayinlangan professor/o'qituvchi bo'lib, boshqa professor/o'qituvchilar bilan hamkorlikda muayyan fan uchun o'quv dasturini ishlab chiqadi. Shuningdek, ular fan doirasidagi ta'lim jarayonini muvofiqlashtiradi va uning mazmuni sifati uchun javobgarlik oladi;</w:t>
       </w:r>
       <w:r>
         <w:rPr>
@@ -1431,7 +1427,7 @@
           <w:color w:val="000000"/>
           <w:sz w:val="28"/>
         </w:rPr>
-        <w:t xml:space="preserve">4. The o'quv dasturi is developed in accordance with  “State Educational Standard  Higher Education. Basic Provisions,” as well as  malaka talablari and o'quv rejasi   relevant educational field and master’s specialty. </w:t>
+        <w:t>4. O'quv dasturi "Oliy ta'limning davlat ta'lim standarti. Asosiy qoidalar"ga, shuningdek tegishli ta'lim yo'nalishi va mutaxassislikning malaka talablari va o'quv rejasiga muvofiq ishlab chiqiladi.</w:t>
       </w:r>
       <w:r>
         <w:rPr>
@@ -1498,7 +1494,7 @@
           <w:color w:val="000000"/>
           <w:sz w:val="28"/>
         </w:rPr>
-        <w:t xml:space="preserve">5. The main purpose   o'quv dasturi is to determine  set  knowledge, skills and competencies that must be formed tomonidan a specific subject included in  o'quv dasturi, in order to ensure  high-quality training  competitive specialists in accordance with  requirements set for  knowledge, abilities, skills and competencies  a bachelor’s or master’s graduate in  state educational standards and malaka talablari, and to organize  content and structural components   subject. </w:t>
+        <w:t>5. O'quv dasturining asosiy maqsadi tegishli ta'lim yo'nalishi va mutaxassislik bitiruvchisi uchun belgilangan malaka talablarining yuqori sifatli bajarilishini ta'minlash maqsadida o'quv rejasiga kiritilgan muayyan fan tomonidan shakllantirilishi kerak bo'lgan bilim, ko'nikma va kompetensiyalar majmuini aniqlashdir.</w:t>
       </w:r>
       <w:r>
         <w:rPr>
@@ -1572,7 +1568,7 @@
           <w:color w:val="000000"/>
           <w:sz w:val="28"/>
         </w:rPr>
-        <w:t xml:space="preserve">6. O'quv dasturining asosiy vazifalari quyidagilardan iborat: </w:t>
+        <w:t>6. O'quv dasturining asosiy vazifalari quyidagilardan iborat:</w:t>
       </w:r>
     </w:p>
     <w:p>
@@ -1592,7 +1588,7 @@
           <w:color w:val="000000"/>
           <w:sz w:val="28"/>
         </w:rPr>
-        <w:t xml:space="preserve">forming  topics  academic sessions taking into account  latest achievements  science, engineering and technology related to  o'quv fani, as well as advanced foreign experience; distributing educational materials tomonidan topics and types  academic sessions in accordance with  ta'lim shakli and  time allotted to  subject, optimizing m, and ensuring ir logical sequence and integration with or subjects; </w:t>
+        <w:t>o'quv faniga oid fan, texnika va texnologiyaning so'nggi yutuqlari, shuningdek ilg'or xorijiy tajribani hisobga olgan holda o'quv mashg'ulotlari mavzularini shakllantirish; o'quv rejasida ajratilgan fan mavzulari va o'quv soatlarini mashg'ulot turlari (ma'ruzalar, seminarlar, amaliy mashg'ulotlar, laboratoriya mashg'ulotlari, kurs ishi va boshq.) va mustaqil ta'lim topshiriqlari o'rtasida optimal tarzda taqsimlash;</w:t>
       </w:r>
       <w:r>
         <w:rPr>
@@ -1657,7 +1653,7 @@
           <w:color w:val="000000"/>
           <w:sz w:val="28"/>
         </w:rPr>
-        <w:t xml:space="preserve">uzluksiz ta'lim tizimi darajalari o'rtasida uzluksizlik va izchillikni ta'minlash, shuningdek fan mazmuni va mavzularining </w:t>
+        <w:t>uzluksiz ta'lim tizimi darajalari o'rtasida uzluksizlik va izchillikni ta'minlash, shuningdek fan mazmuni va mavzularining</w:t>
       </w:r>
       <w:r>
         <w:rPr>
@@ -1705,7 +1701,7 @@
           <w:color w:val="000000"/>
           <w:sz w:val="28"/>
         </w:rPr>
-        <w:t xml:space="preserve">ta'limning boshqa darajalari va tegishli sohalardagi fanlar mazmuni va mavzularini takrorlamasligini ta'minlash; </w:t>
+        <w:t>ta'limning boshqa darajalari va tegishli sohalardagi fanlar mazmuni va mavzularini takrorlamasligini ta'minlash;</w:t>
       </w:r>
       <w:r>
         <w:rPr>
@@ -1734,7 +1730,7 @@
           <w:color w:val="000000"/>
           <w:sz w:val="28"/>
         </w:rPr>
-        <w:t xml:space="preserve">determining  educational-methodical conditions, educational literature and didactic materials necessary for mastering  subject and forming  subject-related competencies, pressional knowledge and skills  learners established in  malaka talablari, as well as determining  forms  monitoring learners’ knowledge using assessment tools and methods. </w:t>
+        <w:t>fanni o'zlashtirish va talabalarning fanga oid kompetensiyalari, kasbiy bilim va ko'nikmalarini shakllantirish uchun zarur bo'lgan o'quv-uslubiy sharoitlar, o'quv adabiyotlari va didaktik materiallarni aniqlash.</w:t>
       </w:r>
       <w:r>
         <w:rPr>
@@ -1829,7 +1825,7 @@
           <w:color w:val="000000"/>
           <w:sz w:val="28"/>
         </w:rPr>
-        <w:t xml:space="preserve">7. In  o'quv dasturi, educational materials are arranged in a logical sequence in  form  lectures, seminars, colloquia, practical and laboratory classes, and educational and production (clinical, creative and or) internships; in addition, in accordance with  purpose and objectives   o'quv fani, course projects, coursework, independent work, design-and-calculation, creative, laboratory and or assignments are included in  o'quv dasturi in accordance with  allotted time norms. </w:t>
+        <w:t>7. O'quv dasturida o'quv materiallari mantiqiy ketma-ketlikda ma'ruzalar, seminarlar, kollokviumlar, amaliy va laboratoriya mashg'ulotlari, o'quv va ishlab chiqarish (klinik, dala) amaliyotlari, mustaqil ta'lim, kurs ishlari (loyihalari), shuningdek tegishli ta'lim shakllarida joylashtiriladi.</w:t>
       </w:r>
       <w:r>
         <w:rPr>
@@ -1903,7 +1899,7 @@
           <w:color w:val="000000"/>
           <w:sz w:val="28"/>
         </w:rPr>
-        <w:t xml:space="preserve">8. O'quv dasturi quyidagi tarkibiy qismlardan iborat bo'lishi shart. </w:t>
+        <w:t>8. O'quv dasturi quyidagi tarkibiy qismlardan iborat bo'lishi shart.</w:t>
       </w:r>
     </w:p>
     <w:p>
@@ -1926,7 +1922,7 @@
           <w:color w:val="000000"/>
           <w:sz w:val="28"/>
         </w:rPr>
-        <w:t xml:space="preserve">8.1. O'quv dasturining muqova sahifasi va 2-sahifasida quyidagilar aks ettirilishi kerak: </w:t>
+        <w:t>8.1. O'quv dasturining muqova sahifasi va 2-sahifasida quyidagilar aks ettirilishi kerak:</w:t>
       </w:r>
       <w:r>
         <w:rPr>
@@ -1955,7 +1951,7 @@
           <w:color w:val="000000"/>
           <w:sz w:val="28"/>
         </w:rPr>
-        <w:t xml:space="preserve"> cover page (title page) shall indicate  name   state body governing higher education,  name   higher education institution,  signed and sealed mark confirming that  o'quv dasturi   approved in  established manner,  full name   o'quv fani,  names   relevant knowledge and education field and  educational field (specialty) toger with ir corresponding codes in accordance with  “State Educational Standard  Higher Education. Classifier  Higher Education Fields and Specialties,” and  year in which  o'quv dasturi was developed and approved; </w:t>
+        <w:t>muqova sahifasida (titul varag'ida) oliy ta'limni boshqaruvchi davlat organining nomi, oliy ta'lim muassasasining nomi, o'quv dasturi tegishli fakultet dekani tomonidan tasdiqlanganligini tasdiqlovchi imzo va muhr belgisi, fan nomi, ta'lim shakli, bilim sohasi kodi va nomi, ta'lim sohasi va ta'lim yo'nalishi, oliy ta'lim muassasasining joylashuvi va yili ko'rsatiladi;</w:t>
       </w:r>
       <w:r>
         <w:rPr>
@@ -2047,7 +2043,7 @@
           <w:color w:val="000000"/>
           <w:sz w:val="28"/>
         </w:rPr>
-        <w:t xml:space="preserve"> second page   o'quv dasturi shall indicate  compilers’ surname, first name, patronymic, academic degree and title, place  work and position;  surname, first name, place  work, position, academic degree and title   reviewers who gave ir opinion on  o'quv dasturi; as well as  number and date   minutes   fakulteti and kafedra Council meetings at which  o'quv dasturi was considered. </w:t>
+        <w:t xml:space="preserve">the second page of the curriculum shall indicate the compilers’ surname, </w:t>
       </w:r>
       <w:r>
         <w:rPr>
@@ -2057,6 +2053,7 @@
           <w:color w:val="000000"/>
           <w:sz w:val="28"/>
         </w:rPr>
+        <w:t xml:space="preserve">first name, patronymic, academic degree and title, place of work and position; </w:t>
       </w:r>
       <w:r>
         <w:rPr>
@@ -2066,6 +2063,7 @@
           <w:color w:val="000000"/>
           <w:sz w:val="28"/>
         </w:rPr>
+        <w:t xml:space="preserve">the surname, first name, place of work, position, academic degree and title of </w:t>
       </w:r>
       <w:r>
         <w:rPr>
@@ -2075,6 +2073,7 @@
           <w:color w:val="000000"/>
           <w:sz w:val="28"/>
         </w:rPr>
+        <w:t xml:space="preserve">the reviewers who gave their opinion on the curriculum; as well as the number </w:t>
       </w:r>
       <w:r>
         <w:rPr>
@@ -2084,6 +2083,7 @@
           <w:color w:val="000000"/>
           <w:sz w:val="28"/>
         </w:rPr>
+        <w:t xml:space="preserve">and date of the minutes of the Faculty and Department Council meetings at </w:t>
       </w:r>
       <w:r>
         <w:rPr>
@@ -2093,6 +2093,7 @@
           <w:color w:val="000000"/>
           <w:sz w:val="28"/>
         </w:rPr>
+        <w:t xml:space="preserve">which the curriculum was considered. </w:t>
       </w:r>
     </w:p>
     <w:p>
@@ -2115,7 +2116,7 @@
           <w:color w:val="000000"/>
           <w:sz w:val="28"/>
         </w:rPr>
-        <w:t xml:space="preserve">8.2. O'quv dasturining uchinchi sahifasidan boshlab quyidagilar aks ettiriladi: </w:t>
+        <w:t>8.2. O'quv dasturining uchinchi sahifasidan boshlab quyidagilar aks ettiriladi:</w:t>
       </w:r>
       <w:r>
         <w:rPr>
@@ -2144,7 +2145,7 @@
           <w:color w:val="000000"/>
           <w:sz w:val="28"/>
         </w:rPr>
-        <w:t xml:space="preserve">Subject information. Ushbu section sets out, in tabular form,  main parameters   o'quv dasturi (subject code, academic year  introduction, semester, credits (soat) allocated to  subject, subject type (compulsory, elective), language  instruction, weekly class soat, name   subject, volume  classroom and independent classes, and total workload); </w:t>
+        <w:t>Fan haqida ma'lumot. Ushbu bo'limda o'quv dasturining asosiy parametrlari jadval shaklida ko'rsatiladi (fan kodi, joriy etilgan o'quv yili, semestr, fanga ajratilgan kreditlar (soatlar), fan turi, ta'lim tili, o'quv rejadagi tartib raqami, haftalik dars soatlari, fan nomi, umumiy ish hajmi soatlari, auditoriya mashg'ulotlari va ularning taqsimoti, mustaqil ta'lim soatlari, kurs ishi);</w:t>
       </w:r>
       <w:r>
         <w:rPr>
@@ -2200,7 +2201,7 @@
           <w:color w:val="000000"/>
           <w:sz w:val="28"/>
         </w:rPr>
-        <w:t xml:space="preserve">Content   subject. The purpose   o'quv fani and its main objectives shall be set out in connection with  tasks  training a specialist in  relevant field (specialty); </w:t>
+        <w:t>Fan mazmuni. O'quv fanining maqsadi va asosiy vazifalari tegishli soha (mutaxassislik) bo'yicha mutaxassis tayyorlash vazifalari bilan bog'liq holda bayon etiladi;</w:t>
       </w:r>
       <w:r>
         <w:rPr>
@@ -2257,7 +2258,7 @@
           <w:color w:val="000000"/>
           <w:sz w:val="28"/>
         </w:rPr>
-        <w:t xml:space="preserve">Fanni o'zlashtirish uchun zarur bo'lgan oldindan talab qilinadigan bilimlar. Ushbu bo'limda ushbu fanni o'zlashtirish uchun zarur bo'lgan o'quv rejadagi oldindan o'tiladigan fanlar ro'yxati keltiriladi. </w:t>
+        <w:t>Fanni o'zlashtirish uchun zarur bo'lgan oldindan talab qilinadigan bilimlar. Ushbu bo'limda ushbu fanni o'zlashtirish uchun zarur bo'lgan o'quv rejadagi oldindan o'tiladigan fanlar ro'yxati keltiriladi.</w:t>
       </w:r>
       <w:r>
         <w:rPr>
@@ -2286,7 +2287,7 @@
           <w:color w:val="000000"/>
           <w:sz w:val="28"/>
         </w:rPr>
-        <w:t xml:space="preserve">Curricula for first-year o'quv fanis are exempt from this requirement; </w:t>
+        <w:t>Birinchi kurs o'quv fanlari uchun o'quv dasturlari ushbu talabdan ozod qilinadi;</w:t>
       </w:r>
     </w:p>
     <w:p>
@@ -2306,7 +2307,7 @@
           <w:color w:val="000000"/>
           <w:sz w:val="28"/>
         </w:rPr>
-        <w:t xml:space="preserve">Learning outcomes. Ushbu section sets out  pressional competencies, knowledge and skills established in  malaka talablari that a student must acquire specifically through this subject upon mastering it; </w:t>
+        <w:t>O'quv natijalari. Ushbu bo'limda talaba aynan shu fan orqali egallab olishi kerak bo'lgan malaka talablarida belgilangan kasbiy kompetensiyalar, bilim va ko'nikmalar bayon etiladi (ushbu bo'lim kompetensiyalar va ko'nikmalarni o'z ichiga olishi kerak);</w:t>
       </w:r>
       <w:r>
         <w:rPr>
@@ -2344,7 +2345,7 @@
           <w:color w:val="000000"/>
           <w:sz w:val="28"/>
         </w:rPr>
-        <w:t xml:space="preserve">Content   subject and forms  classes. The content   o'quv fani is divided into types  classes in accordance with its structure, purpose and objectives. The main oretical part   subject is given in  “Ma'ruza” section. Ma'ruza topics are taqdim etilgan in a logical sequence, with  essence  each topic expressed through basic concepts and brief statements, covering  knowledge and skills that must be conveyed to learners on  basis   state educational standard and malaka talablari. The main oretical part may be taqdim etilgan in  form  modules; </w:t>
+        <w:t>Fan mazmuni va mashg'ulot shakllari. O'quv fanining mazmuni uning tuzilishi, maqsadi va vazifalariga muvofiq mashg'ulot turlariga bo'linadi. Fanning asosiy nazariy qismi, ya'ni fan mazmunining o'zagini tashkil etuvchi qism, ma'ruzalar deb belgilangan mashg'ulot turlarida aks ettiriladi va har bir ma'ruza uchun mavzu, kod va o'quv soatlari soni ko'rsatiladi;</w:t>
       </w:r>
       <w:r>
         <w:rPr>
@@ -2427,7 +2428,7 @@
           <w:color w:val="000000"/>
           <w:sz w:val="28"/>
         </w:rPr>
-        <w:t xml:space="preserve">In accordance with  nature and oretical content   o'quv fani, classes are recorded under “Amaliy Classes,” “Seminars,” “Laboratoriya Classes” and or forms mainly aimed at mastering practical skills. Ushbu section covers  topics  se classes,  procedure for conducting m,  recommended educational technologies, methods and tools to be used,  topics and issues to be discussed where necessary,  content and purpose  laboratory work, and or information arising from  nature   subject. It also covers  nature, content, purpose and topics  course projects, coursework and creative work,  forms for carrying m out, and or information arising from  nature   subject. In addition, this section provides brief methodical guidelines on  purpose, tasks, form and content  educational and production internships, and on  form   final work that learners must prepare during  internship; </w:t>
+        <w:t>O'quv fanining xarakteri va nazariy mazmuniga muvofiq, mashg'ulotlar "Amaliy mashg'ulotlar", "Seminarlar", "Laboratoriya mashg'ulotlari" va asosan o'quv fanidagi amaliy kompetensiyalar va ko'nikmalarni o'zlashtirishga qaratilgan boshqa shakllarda qayd etiladi va har bir mashg'ulot uchun mavzu va o'quv soatlari soni ko'rsatiladi;</w:t>
       </w:r>
       <w:r>
         <w:rPr>
@@ -2555,7 +2556,7 @@
           <w:color w:val="000000"/>
           <w:sz w:val="28"/>
         </w:rPr>
-        <w:t xml:space="preserve">Independent study assignments. Ushbu section lists  assignments that students must master independently and that are intended for independent work. Independent study assignments are organized on  basis  methodical guidelines developed tomonidan  departments  higher education institutions for organizing students’ independent study. In this regard,  independent work assignments performed tomonidan students for  subject (module) may be  a varied nature. It is advisable that at least one-third   independent work assignments be designed for cooperative work in small groups; </w:t>
+        <w:t>Mustaqil ta'lim topshiriqlari. Ushbu bo'limda talabalar mustaqil ravishda o'zlashtirishlari kerak bo'lgan va mustaqil ish uchun mo'ljallangan topshiriqlar ro'yxati keltiriladi. Mustaqil ta'lim topshiriqlari o'quv natijalariga kiritilgan kompetensiyalar, bilim va ko'nikmalarni shakllantiradigan amaliy faoliyat asosida tashkil etiladi. Mustaqil ta'lim topshiriqlarining uchdan bir qismi 2-3 talabadan iborat guruhlarda hamkorlikda ishlash uchun mo'ljallangan bo'lishi kerak. Hamkorlik topshiriqlari talabalar o'rtasida jamoaviy ishlash kompetensiyalarini mustahkamlovchi muayyan faoliyatlarni o'z ichiga oladi;</w:t>
       </w:r>
       <w:r>
         <w:rPr>
@@ -2638,7 +2639,7 @@
           <w:color w:val="000000"/>
           <w:sz w:val="28"/>
         </w:rPr>
-        <w:t xml:space="preserve">Educational technologies and methods. Ushbu section describes  classes used for mastering  o'quv fani, and  pedagogical technologies </w:t>
+        <w:t>Ta'lim texnologiyalari va usullari. Ushbu bo'limda o'quv fanini o'zlashtirish uchun qo'llaniladigan mashg'ulotlar va pedagogik texnologiyalar</w:t>
       </w:r>
       <w:r>
         <w:rPr>
@@ -2686,7 +2687,7 @@
           <w:color w:val="000000"/>
           <w:sz w:val="28"/>
         </w:rPr>
-        <w:t xml:space="preserve">and methods used in conducting classes (writing essays, ses and articles, group work, project-based assignments, preparing presentations, conducting surveys, forming independent-work competencies, etc.); </w:t>
+        <w:t>va mashg'ulotlar o'tkazishda qo'llaniladigan usullar (esse, tezis va maqolalar yozish, guruh ishi, loyihaviy topshiriqlar, taqdimotlar tayyorlash, so'rovnomalar o'tkazish, mustaqil ish kompetensiyalarini shakllantirish va boshqalar) tavsiflandi;</w:t>
       </w:r>
       <w:r>
         <w:rPr>
@@ -2724,7 +2725,7 @@
           <w:color w:val="000000"/>
           <w:sz w:val="28"/>
         </w:rPr>
-        <w:t xml:space="preserve">Requirements for students to obtain credits. Ushbu section establishes  requirements for monitoring (assessing) students’ knowledge and for obtaining credits in  o'quv fani; </w:t>
+        <w:t>Talabalarning kredit olish talablari. Ushbu bo'limda talabalar bilimini nazorat qilish (baholash) va o'quv fanidan kredit olish talablari belgilanadi;</w:t>
       </w:r>
       <w:r>
         <w:rPr>
@@ -2762,7 +2763,7 @@
           <w:color w:val="000000"/>
           <w:sz w:val="28"/>
         </w:rPr>
-        <w:t xml:space="preserve">Criteria for assessing students’ knowledge. Ushbu section presents  criteria for assessing students’ knowledge in a logical sequence and to an extent corresponding to  weight   grades. The assessment criteria must ensure that  degree to which a student  mastered a particular o'quv fani is determined reasonably. In art, culture, sport and or specific educational fields,  assessment criteria are established in accordance with  nature  se fields; </w:t>
+        <w:t>Talabalar bilimini baholash mezonlari. Ushbu bo'limda talabalar bilimini baholash mezonlari baholar og'irligiga mos ravishda mantiqiy ketma-ketlikda keltiriladi. Baholash mezonlari o'quv natijalari asosida shakllantiriladi;</w:t>
       </w:r>
       <w:r>
         <w:rPr>
@@ -2836,7 +2837,7 @@
           <w:color w:val="000000"/>
           <w:sz w:val="28"/>
         </w:rPr>
-        <w:t xml:space="preserve">Recommended literature and sources. The list   main literature used and additional literature is provided, indicating its availability (printed or electronic) in  information-resource centers   higher education institution, as well as various information and communication resources from  Internet, dissertations and monographs. Literature should be reflected as broadly and in as much detail as possible. In this regard, sources used at foreign universities included in  world’s authoritative TOP-300 ranking for  subject, as well as scientific articles published in  most authoritative journals, should also be recommended. It is also recommended that  main literature be published within  last 5 years and comprise at least 3-5 titles, depending on  nature   subject. </w:t>
+        <w:t>Tavsiya etilgan adabiyotlar va manbalar. Foydalanilgan asosiy adabiyotlar va qo'shimcha adabiyotlar ro'yxati oliy ta'lim muassasasining axborot-resurs markazlarida (kutubxonalarida) mavjudligi (bosma yoki elektron) ko'rsatilgan holda taqdim etiladi. Axborot manbalari — kamida 3 ta jahonga mashhur ta'lim muassasalari va tashkilotlarning ta'lim sahifalari va o'quv dasturlariga veb-saytlar va havolalar.</w:t>
       </w:r>
       <w:r>
         <w:rPr>
@@ -2985,7 +2986,7 @@
           <w:color w:val="000000"/>
           <w:sz w:val="28"/>
         </w:rPr>
-        <w:t xml:space="preserve">9. Curricula for each o'quv fani specified in  study plans are developed and approved tomonidan higher education institutions in accordance with  state educational standards  higher education,  malaka talablari  bachelor’s educational fields and master’s specialties, and  study plans. </w:t>
+        <w:t>9. O'quv rejalarida ko'rsatilgan har bir o'quv fani uchun o'quv dasturlari oliy ta'lim muassasalari tomonidan oliy ta'limning davlat ta'lim standartlari, shuningdek tegishli ta'lim yo'nalishi va mutaxassislikning malaka talablari va o'quv rejasiga muvofiq ishlab chiqiladi va tasdiqlanadi.</w:t>
       </w:r>
       <w:r>
         <w:rPr>
@@ -3041,7 +3042,7 @@
           <w:color w:val="000000"/>
           <w:sz w:val="28"/>
         </w:rPr>
-        <w:t xml:space="preserve">10. The curricula for  subjects “Modern History  Uzbekistan” (including  module on National Pride and Patriotism) and “Philosophy” (including  modules on Religious Studies and Anti-Corruption), which are recommended for inclusion in study plans, are developed and approved tomonidan  relevant leading higher education institution in  field  humanities. Or higher education institutions shall use se curricula. </w:t>
+        <w:t>10. "O'zbekistonning zamonaviy tarixi" (Milliy g'urur va vatanparvarlik moduli bilan) va "Falsafa" (Dinshunaslik va Korrupsiyaga qarshi kurash modullari bilan) fanlari uchun o'quv dasturlari Oliy ta'lim, fan va innovatsiyalar vazirligi qoshidagi ishchi guruhlar tomonidan yagona mazmun asosida ishlab chiqiladi va barcha ta'lim yo'nalishlari va mutaxassisliklari uchun majburiy bo'ladi.</w:t>
       </w:r>
       <w:r>
         <w:rPr>
@@ -3106,7 +3107,7 @@
           <w:color w:val="000000"/>
           <w:sz w:val="28"/>
         </w:rPr>
-        <w:t xml:space="preserve">11. Curricula are formed on  basis   purpose, tasks, content and nature   educational fields and specialties, arranging  topics and content   subject in a logical sequence in  established manner, and observing  time norms allotted to  o'quv fani. </w:t>
+        <w:t>11. O'quv dasturlari ta'lim yo'nalishlari va mutaxassisliklarning maqsadi, vazifalari, mazmuni va xarakteriga asosan, fan mavzulari va mazmunini ma'ruzalar, amaliy va laboratoriya mashg'ulotlari, seminarlar, kurs ishlari (loyihalari), mustaqil ta'lim topshiriqlari va boshqa ta'lim mashg'ulotlari shakllarida mantiqiy ketma-ketlikda joylashtirib shakllantiriladi.</w:t>
       </w:r>
       <w:r>
         <w:rPr>
@@ -3153,7 +3154,7 @@
           <w:color w:val="000000"/>
           <w:sz w:val="28"/>
         </w:rPr>
-        <w:t xml:space="preserve">12. The o'quv dasturi is developed in  language  instruction (Uzbek, Russian, Karakalpak, etc.) on  basis   “State Educational Standard  Higher Education. Basic Provisions,”  pressional standard,  malaka talablari and  study plan, and is approved in  established manner tomonidan  dean   faculty (in higher education institutions without a faculty dean, tomonidan  heads  departments) before  start   educational process. </w:t>
+        <w:t>12. O'quv dasturi ta'lim tilida (o'zbek, rus, qoraqalpoq va boshq.) "Oliy ta'limning davlat ta'lim standarti. Asosiy qoidalar", tegishli ta'lim yo'nalishi va mutaxassislikning kasbiy tayyorlash standartlari va o'quv rejalari asosida ishlab chiqiladi.</w:t>
       </w:r>
       <w:r>
         <w:rPr>
@@ -3227,7 +3228,7 @@
           <w:color w:val="000000"/>
           <w:sz w:val="28"/>
         </w:rPr>
-        <w:t xml:space="preserve">13. O'quv dasturlari yangi o'quv yili boshlanishidan oldin tasdiqlanishi va bitta asl nusxasi elektron (PDF) nusxasi bilan birga o'quv-uslubiy bo'limda saqlanishi kerak. </w:t>
+        <w:t>13. O'quv dasturlari yangi o'quv yili boshlanishidan oldin tasdiqlanishi va bitta asl nusxasi elektron (PDF) nusxasi bilan birga o'quv-uslubiy bo'limda saqlanishi kerak.</w:t>
       </w:r>
       <w:r>
         <w:rPr>
@@ -3265,7 +3266,7 @@
           <w:color w:val="000000"/>
           <w:sz w:val="28"/>
         </w:rPr>
-        <w:t xml:space="preserve">14. The text   o'quv dasturi is printed on standard A4 sheets, in 14-point “Times New Roman” font, with 1.15 line spacing, with margins  20 mm on  left and right, 25 mm at  bottom, and 20 mm at  top, with page numbers placed in  center   bottom   sheet. </w:t>
+        <w:t>14. O'quv dasturi matni standart A4 varaqlarda, 14-punktli "Times New Roman" shriftida, 1,15 qator oralig'ida, chap va o'ng tomondan 20 mm, pastdan 25 mm va yuqoridan 20 mm chegaralar bilan chop etiladi.</w:t>
       </w:r>
       <w:r>
         <w:rPr>
@@ -3312,7 +3313,7 @@
           <w:color w:val="000000"/>
           <w:sz w:val="28"/>
         </w:rPr>
-        <w:t xml:space="preserve">Tasdiqlangandan so'ng, o'quv dasturlari A5 formatida buklet shaklida chiqariladi. </w:t>
+        <w:t>Tasdiqlangandan so'ng, o'quv dasturlari A5 formatida buklet shaklida chiqariladi.</w:t>
       </w:r>
     </w:p>
     <w:p>
@@ -3332,7 +3333,7 @@
           <w:color w:val="000000"/>
           <w:sz w:val="28"/>
         </w:rPr>
-        <w:t xml:space="preserve">15. The approved electronic (PDF) copies  approved curricula are kept, in  established manner, at  Center for Higher Education Development Research under  Ministry  Higher Education, Science and Innovation   Republic  Uzbekistan. </w:t>
+        <w:t>15. Tasdiqlangan o'quv dasturlarining tasdiqlangan elektron (PDF) nusxalari belgilangan tartibda Oliy ta'lim, fan va innovatsiyalar vazirligi qoshidagi Oliy ta'limni rivojlantirish tadqiqotlari markazida saqlanadi.</w:t>
       </w:r>
       <w:r>
         <w:rPr>
@@ -3398,7 +3399,7 @@
           <w:color w:val="000000"/>
           <w:sz w:val="28"/>
         </w:rPr>
-        <w:t xml:space="preserve">16. The curricula for full-time (daytime) education serve as  basis for or forms  education. Curricula are prepared taking into account  specific features   educational fields and specialties. </w:t>
+        <w:t>16. Kunduzgi ta'lim uchun o'quv dasturlari boshqa ta'lim shakllari uchun asos bo'lib xizmat qiladi. O'quv dasturlari ta'lim yo'nalishlari va mutaxassisliklarning o'ziga xos xususiyatlarini hisobga olgan holda tayyorlanadi. Oliy ta'lim muassasalari rektorlari va filiallar direktorlari ishlab chiqilgan o'quv dasturlarining sifati uchun shaxsan javobgar bo'ladilar.</w:t>
       </w:r>
       <w:r>
         <w:rPr>
@@ -3436,7 +3437,7 @@
           <w:color w:val="000000"/>
           <w:sz w:val="28"/>
         </w:rPr>
-        <w:t xml:space="preserve">On  basis   basic curricula, working curricula are developed in  established manner for forms  education combined with employment (evening (shift-based), correspondence (special correspondence), and distance education) and are approved tomonidan  relevant higher education institutions. </w:t>
+        <w:t>Asosiy o'quv dasturlari asosida ish bilan qo'shib olib boriladigan ta'lim shakllari (kechki (smenali), sirtqi (maxsus sirtqi), masofaviy ta'lim) uchun belgilangan tartibda ishchi o'quv dasturlari ishlab chiqiladi.</w:t>
       </w:r>
       <w:r>
         <w:rPr>
@@ -3512,7 +3513,7 @@
           <w:color w:val="000000"/>
           <w:sz w:val="28"/>
         </w:rPr>
-        <w:t xml:space="preserve">17. Curricula prepared tomonidan higher education institutions are subject to selective, ongoing monitoring and analysis tomonidan  Center for Higher Education Development Research under  Ministry  Higher Education, Science and Innovation   Republic  Uzbekistan, in terms  ir compliance with  state educational standards, malaka talablari and study plans  higher education, as well as ir quality. </w:t>
+        <w:t>17. Oliy ta'lim muassasalari tomonidan tayyorlangan o'quv dasturlari Oliy ta'lim, fan va innovatsiyalar vazirligi qoshidagi Oliy ta'limni rivojlantirish tadqiqotlari markazi tomonidan tanlab, doimiy monitoring va tahlil qilinadi.</w:t>
       </w:r>
       <w:r>
         <w:rPr>
@@ -3599,9 +3600,7 @@
           <w:color w:val="000000"/>
           <w:sz w:val="28"/>
         </w:rPr>
-        <w:t xml:space="preserve">Annex 2 to Order No. 142   Vazir  Higher Education, Science and </w:t>
-        <w:tab/>
-        <w:t>2026-yil 15-apreldagi 142-son buyrug'iga 1-ilova</w:t>
+        <w:t>Oliy ta'lim, fan va innovatsiyalar vazirining 2026-yil 15-apreldagi 142-son buyrug'iga 2-ilova</w:t>
       </w:r>
       <w:r/>
       <w:r>
@@ -3761,7 +3760,7 @@
           <w:color w:val="000000"/>
           <w:sz w:val="28"/>
         </w:rPr>
-        <w:t xml:space="preserve">______________________ F. Raxmatullayev </w:t>
+        <w:t xml:space="preserve">______________________ F. Rakhmatullayev </w:t>
       </w:r>
     </w:p>
     <w:p>
@@ -3801,11 +3800,7 @@
           <w:color w:val="000000"/>
           <w:sz w:val="28"/>
         </w:rPr>
-        <w:t xml:space="preserve">O'QUV DASTURI </w:t>
-        <w:br/>
-        <w:t>FOR THE SUBJECT “ECOLOGY”</w:t>
-        <w:br/>
-        <w:t xml:space="preserve">(kunduzgi ta'lim) </w:t>
+        <w:t>O'QUV DASTURI</w:t>
       </w:r>
       <w:r/>
       <w:r>
@@ -3845,7 +3840,7 @@
           <w:color w:val="000000"/>
           <w:sz w:val="28"/>
         </w:rPr>
-        <w:t xml:space="preserve">Bilim soi: 700 000 – Muhandislik, ishlab chiqarish va qurilish </w:t>
+        <w:t>Bilim sohasi: 700 000 – Muhandislik, ishlab chiqarish va qurilish</w:t>
       </w:r>
     </w:p>
     <w:p>
@@ -3865,7 +3860,7 @@
           <w:color w:val="000000"/>
           <w:sz w:val="28"/>
         </w:rPr>
-        <w:t xml:space="preserve">Ta'lim soi: 710 000 – Muhandislik </w:t>
+        <w:t>Ta'lim sohasi: 710 000 – Muhandislik</w:t>
       </w:r>
     </w:p>
     <w:p>
@@ -3885,7 +3880,7 @@
           <w:color w:val="000000"/>
           <w:sz w:val="28"/>
         </w:rPr>
-        <w:t xml:space="preserve">Ta'lim yo'nalishi: 60711800 – Environmental Muhandislik </w:t>
+        <w:t>Ta'lim yo'nalishi: 60711800 – Atrof-muhit muhandisligi</w:t>
       </w:r>
     </w:p>
     <w:p>
@@ -3905,7 +3900,7 @@
           <w:color w:val="000000"/>
           <w:sz w:val="28"/>
         </w:rPr>
-        <w:t>Tashkent – 2026</w:t>
+        <w:t>Toshkent – 2026</w:t>
       </w:r>
     </w:p>
     <w:p>
@@ -3947,7 +3942,7 @@
           <w:color w:val="000000"/>
           <w:sz w:val="28"/>
         </w:rPr>
-        <w:t xml:space="preserve">Ushbu o'quv dasturi Neft va gaz fakulteti kengashi yig'ilishining 2026-yil 20-avgustdagi 6-son bayonnomasi bilan tasdiqlangan. </w:t>
+        <w:t>Ushbu o'quv dasturi Neft va gaz fakulteti kengashi yig'ilishining 2026-yil 20-avgustdagi 6-son bayonnomasi bilan tasdiqlangan.</w:t>
       </w:r>
       <w:r>
         <w:rPr>
@@ -3976,7 +3971,7 @@
           <w:color w:val="000000"/>
           <w:sz w:val="28"/>
         </w:rPr>
-        <w:t xml:space="preserve">Ushbu o'quv dasturi   taqdim etilgan tomonidan  kafedra  “Ecology and Environmental Protection”  Tashkent State Technical University (Minutes No. 7   department meeting dated 15 August 2026). </w:t>
+        <w:t>Ushbu o'quv dasturi Toshkent davlat texnika universitetining "Ekologiya va atrof-muhit muhofazasi" kafedrasi tomonidan taqdim etilgan (kafedra yig'ilishining 2026-yil 15-avgustdagi 7-son bayonnomasi).</w:t>
       </w:r>
       <w:r>
         <w:rPr>
@@ -4034,7 +4029,7 @@
           <w:color w:val="000000"/>
           <w:sz w:val="28"/>
         </w:rPr>
-        <w:t xml:space="preserve">U. Safayev – Doctor  Technical Sciences, Pressor, teacher   kafedra  “Ecology and Environmental Protection”  Tashkent State Technical University. </w:t>
+        <w:t>U. Safayev – texnika fanlari doktori, professor, Toshkent davlat texnika universiteti "Ekologiya va atrof-muhit muhofazasi" kafedrasi o'qituvchisi.</w:t>
       </w:r>
       <w:r>
         <w:rPr>
@@ -4072,7 +4067,7 @@
           <w:color w:val="000000"/>
           <w:sz w:val="28"/>
         </w:rPr>
-        <w:t xml:space="preserve">M. Ziyayeva – PhD, Associate Pressor, teacher   kafedra  “Ecology and Environmental Protection”  Tashkent State Technical University. </w:t>
+        <w:t>M. Ziyayeva – PhD, dotsent, Toshkent davlat texnika universiteti "Ekologiya va atrof-muhit muhofazasi" kafedrasi o'qituvchisi.</w:t>
       </w:r>
       <w:r>
         <w:rPr>
@@ -4130,7 +4125,7 @@
           <w:color w:val="000000"/>
           <w:sz w:val="28"/>
         </w:rPr>
-        <w:t xml:space="preserve">U. Xolmatov – Doctor  Technical Sciences, Pressor, teacher   kafedra  “Ecology and Environmental Protection”  Tashkent Institute  Chemical Technology. </w:t>
+        <w:t>U. Xolmatov – texnika fanlari doktori, professor, Toshkent kimyo-texnologiya instituti "Ekologiya va atrof-muhit muhofazasi" kafedrasi o'qituvchisi.</w:t>
       </w:r>
       <w:r>
         <w:rPr>
@@ -5208,7 +5203,7 @@
                 <w:color w:val="000000"/>
                 <w:sz w:val="28"/>
               </w:rPr>
-              <w:t>Auditoriya mashg'ulotlari, jami – 60 soat, shundan:</w:t>
+              <w:t>Auditoriya mashg'ulotlari, jami</w:t>
             </w:r>
             <w:r>
               <w:rPr>
@@ -5261,7 +5256,7 @@
                 <w:color w:val="000000"/>
                 <w:sz w:val="28"/>
               </w:rPr>
-              <w:t xml:space="preserve">Ma'ruza – 30; Amaliy – 16; Laboratoriya – 14 </w:t>
+              <w:t>Ma'ruza – 30; Amaliy – 16; Laboratoriya – 14</w:t>
             </w:r>
             <w:r>
               <w:rPr>
@@ -5548,7 +5543,7 @@
           <w:color w:val="000000"/>
           <w:sz w:val="28"/>
         </w:rPr>
-        <w:t xml:space="preserve">Fanning maqsadi talabalarga tabiat va jamiyat o'rtasidagi o'zaro bog'liqliklarni o'rgatish, ularga ekologik muammolar va ularni hal qilish usullarini tushunishga yordam berishdir. </w:t>
+        <w:t>Fanning maqsadi talabalarga tabiat va jamiyat o'rtasidagi o'zaro bog'liqliklarni o'rgatish, ularga ekologik muammolar va ularni hal qilish usullarini tushunishga yordam berishdir.</w:t>
       </w:r>
       <w:r>
         <w:rPr>
@@ -5586,7 +5581,7 @@
           <w:color w:val="000000"/>
           <w:sz w:val="28"/>
         </w:rPr>
-        <w:t xml:space="preserve">Fanning vazifalari to study  oretical foundations  ecology and  main components   environment, to understand ecological balance and  consequences  its disruption, to analyze environmental risks and sources  pollution, and to become familiar with  principles  sustainable development. </w:t>
+        <w:t>Fanning vazifalari ekologiyaning nazariy asoslari va atrof-muhitning asosiy tarkibiy qismlarini o'rganish, ekologik muvozanat va uni buzilishi oqibatlarini tushunish, tabiiy resurslardan to'g'ri foydalanish ko'nikmalarini rivojlantirish va atrof-muhitni muhofaza qilish chora-tadbirlarini qo'llashdir.</w:t>
       </w:r>
       <w:r>
         <w:rPr>
@@ -6227,7 +6222,7 @@
                 <w:color w:val="000000"/>
                 <w:sz w:val="28"/>
               </w:rPr>
-              <w:t xml:space="preserve">must possess basic initial knowledge   oretical foundations  ecology and environmental pollution; </w:t>
+              <w:t>ekologiya va atrof-muhit muhofazasining nazariy asoslari bo'yicha boshlang'ich bilimga ega bo'lishi kerak.</w:t>
             </w:r>
             <w:r>
               <w:rPr>
@@ -6311,7 +6306,7 @@
                 <w:color w:val="000000"/>
                 <w:sz w:val="28"/>
               </w:rPr>
-              <w:t xml:space="preserve">must be able to identify  measures and methods carried out for nature conservation; </w:t>
+              <w:t>tabiatni muhofaza qilish va atrof-muhitni himoya qilish uchun amalga oshirilayotgan chora-tadbirlar va usullarni aniqlashga qodir bo'lishi kerak.</w:t>
             </w:r>
             <w:r>
               <w:rPr>
@@ -6395,7 +6390,7 @@
                 <w:color w:val="000000"/>
                 <w:sz w:val="28"/>
               </w:rPr>
-              <w:t xml:space="preserve"> student must have knowledge   current state   field, its development prospects, and  specific features  ir application; </w:t>
+              <w:t>talaba sohaning hozirgi holati, uning rivojlanish yo'nalishlari va ekologik xavfsizlik chora-tadbirlari haqida bilimga ega bo'lishi kerak.</w:t>
             </w:r>
             <w:r>
               <w:rPr>
@@ -6488,7 +6483,7 @@
                 <w:color w:val="000000"/>
                 <w:sz w:val="28"/>
               </w:rPr>
-              <w:t xml:space="preserve">tabiiy resurslardan to'g'ri foydalanish tamoyillari haqida bilimga ega bo'lishi kerak. </w:t>
+              <w:t>tabiiy resurslardan to'g'ri foydalanish tamoyillari haqida bilimga ega bo'lishi kerak.</w:t>
             </w:r>
             <w:r>
               <w:rPr>
@@ -6572,7 +6567,7 @@
                 <w:color w:val="000000"/>
                 <w:sz w:val="28"/>
               </w:rPr>
-              <w:t xml:space="preserve">knows  specific features  linking human production activity with  environment and knows how to apply m; </w:t>
+              <w:t>inson ishlab chiqarish faoliyatini atrof-muhit bilan bog'lashning o'ziga xos xususiyatlarini biladi.</w:t>
             </w:r>
             <w:r>
               <w:rPr>
@@ -6656,7 +6651,7 @@
                 <w:color w:val="000000"/>
                 <w:sz w:val="28"/>
               </w:rPr>
-              <w:t xml:space="preserve">is able to help future specialists coordinate production activity with  environment; </w:t>
+              <w:t>kelajakdagi mutaxassislarga ishlab chiqarish faoliyatini atrof-muhit bilan muvofiqlashtirish bo'yicha yordam berish qobiliyatiga ega.</w:t>
             </w:r>
             <w:r>
               <w:rPr>
@@ -6858,7 +6853,7 @@
                 <w:color w:val="000000"/>
                 <w:sz w:val="28"/>
               </w:rPr>
-              <w:t xml:space="preserve">tabiiy resurslardan to'g'ri foydalanish ko'nikmalarini egallashga qodir; </w:t>
+              <w:t>tabiiy resurslardan to'g'ri foydalanish ko'nikmalarini egallashga qodir;</w:t>
             </w:r>
             <w:r>
               <w:rPr>
@@ -6942,7 +6937,7 @@
                 <w:color w:val="000000"/>
                 <w:sz w:val="28"/>
               </w:rPr>
-              <w:t xml:space="preserve">knows how to make initial decisions on how to properly approach  solution  existing environmental problems. </w:t>
+              <w:t>ekologik muammolarni hal qilishga to'g'ri yondashish bo'yicha dastlabki qarorlar qabul qilishni biladi.</w:t>
             </w:r>
             <w:r>
               <w:rPr>
@@ -7026,7 +7021,7 @@
                 <w:color w:val="000000"/>
                 <w:sz w:val="28"/>
               </w:rPr>
-              <w:t xml:space="preserve">acquires  skill  searching for and evaluating  necessary information from various sources related to ecology, and using it to perform pressional tasks on  basis  a systematic approach; </w:t>
+              <w:t>turli manbalardan zarur axborotni izlash va baholash ko'nikmasini egallaydi.</w:t>
             </w:r>
             <w:r>
               <w:rPr>
@@ -7138,7 +7133,7 @@
                 <w:color w:val="000000"/>
                 <w:sz w:val="28"/>
               </w:rPr>
-              <w:t xml:space="preserve">is able to critically analyze situations in order to find  most effective solutions to environmental problems, and applies environmental norms, technical regulations and industry standards in daily activity. </w:t>
+              <w:t>eng samarali yechimni topish uchun vaziyatlarni tanqidiy tahlil qilishga qodir.</w:t>
             </w:r>
             <w:r>
               <w:rPr>
@@ -7268,7 +7263,7 @@
           <w:color w:val="000000"/>
           <w:sz w:val="28"/>
         </w:rPr>
-        <w:t>Ma'ruza (M) — 30 soat</w:t>
+        <w:t>Ma'ruza (M)</w:t>
       </w:r>
     </w:p>
     <w:tbl>
@@ -7484,7 +7479,7 @@
                 <w:color w:val="000000"/>
                 <w:sz w:val="28"/>
               </w:rPr>
-              <w:t xml:space="preserve">Introduction. Theoretical foundations  ecology and environmental protection. Cultural and historical stages  ecology. The purpose and objectives   subject. </w:t>
+              <w:t>Kirish. Ekologiya va atrof-muhit muhofazasining nazariy asoslari. Ekologiyaning tushunchasi va ta'rifi. Ekologiyaning tarixi va rivojlanishi.</w:t>
             </w:r>
             <w:r>
               <w:rPr>
@@ -7522,7 +7517,7 @@
                 <w:color w:val="000000"/>
                 <w:sz w:val="28"/>
               </w:rPr>
-              <w:t xml:space="preserve">The state   environment in Uzbekistan. [1,2] </w:t>
+              <w:t xml:space="preserve">The state of the environment in Uzbekistan. [1,2] </w:t>
             </w:r>
           </w:p>
         </w:tc>
@@ -7632,9 +7627,7 @@
                 <w:color w:val="000000"/>
                 <w:sz w:val="28"/>
               </w:rPr>
-              <w:t xml:space="preserve">Environmental factors and ir types. The influence  environmental factors on organisms. Anthropogenic changes and ir types. Ecological laws and </w:t>
-              <w:br/>
-              <w:t xml:space="preserve">regularities. [1,2] </w:t>
+              <w:t>Atrof-muhit omillari va ularning turlari. Atrof-muhit omillarining tirik organizmlarga ta'siri.</w:t>
             </w:r>
             <w:r>
               <w:rPr>
@@ -7772,13 +7765,7 @@
                 <w:color w:val="000000"/>
                 <w:sz w:val="28"/>
               </w:rPr>
-              <w:t xml:space="preserve">Biosfera tushunci, uning tarkibi va </w:t>
-              <w:br/>
-              <w:t xml:space="preserve">funksiyalari, biosfera va  universe. The concepts  ecosystem, population and biogeocenosis. The </w:t>
-              <w:br/>
-              <w:t xml:space="preserve">circulation  substances in nature. Stability and </w:t>
-              <w:br/>
-              <w:t xml:space="preserve">ecological succession in an ecosystem. [1,2,4] </w:t>
+              <w:t>Biosfera tushunchasi, uning tarkibi va funksiyalari, biosfera va</w:t>
             </w:r>
             <w:r/>
             <w:r>
@@ -7927,7 +7914,7 @@
                 <w:color w:val="000000"/>
                 <w:sz w:val="28"/>
               </w:rPr>
-              <w:t xml:space="preserve">Natural resources, ir classification and types. Energy and mineral raw material resources. Real and potential resources. Alternative and environmentally clean energy sources in industry. [1,2,4] </w:t>
+              <w:t>Tabiiy resurslar, ularning tasnifi va turlari. Energiya va mineral xom ashyolar.</w:t>
             </w:r>
             <w:r>
               <w:rPr>
@@ -8064,7 +8051,7 @@
                 <w:color w:val="000000"/>
                 <w:sz w:val="28"/>
               </w:rPr>
-              <w:t xml:space="preserve">Tabiatdan foydalanish tushunci. Tabiiy resurslardan samarali foydalanish tamoyillari. Problems   rational use  underground minerals. The use  mineral resources in Uzbekistan. [4] </w:t>
+              <w:t>Tabiatdan foydalanish tushunchasi. Tabiiy resurslardan samarali foydalanish tamoyillari.</w:t>
             </w:r>
             <w:r>
               <w:rPr>
@@ -8201,9 +8188,7 @@
                 <w:color w:val="000000"/>
                 <w:sz w:val="28"/>
               </w:rPr>
-              <w:t xml:space="preserve">The atmosphere. The composition and structure   atmosphere. Atmospheric pollution and its sources. The global carbon cycle on Earth; deforestation, land </w:t>
-              <w:br/>
-              <w:t xml:space="preserve">degradation ( greenhouse effect, acid rain, depletion   ozone layer). [2,6] </w:t>
+              <w:t>Atmosfera. Atmosferaning tarkibi va tuzilishi. Atmosfera ifloslanishi va uning oqibatlari.</w:t>
             </w:r>
             <w:r>
               <w:rPr>
@@ -8350,11 +8335,7 @@
                 <w:color w:val="000000"/>
                 <w:sz w:val="28"/>
               </w:rPr>
-              <w:t xml:space="preserve">Pollution  atmospheric air with toxic gases, and ways to reduce and neutralize it. Global change – climate change, loss  habitats and invasion  species. </w:t>
-              <w:br/>
-              <w:t xml:space="preserve">Sanitary-hygienic and ecological standardization  environmental quality. The concepts  maximum permissible concentration (MPC) and maximum </w:t>
-              <w:br/>
-              <w:t xml:space="preserve">permissible emission (MPE) standards. [2,6,7] </w:t>
+              <w:t>Atmosfera havosining zaharli gazlar bilan ifloslanishi va ularni kamaytirish va zararsizlantirish yo'llari.</w:t>
             </w:r>
             <w:r>
               <w:rPr>
@@ -8520,7 +8501,7 @@
                 <w:color w:val="000000"/>
                 <w:sz w:val="28"/>
               </w:rPr>
-              <w:t xml:space="preserve">Muhandislik measures for protecting atmospheric air. Methods for purifying atmospheric air  toxic gases. Adsorption, absorption, chemisorption, catalytic and rmal purification methods. [2,5,6] </w:t>
+              <w:t>Atmosfera havosini muhofaza qilishning muhandislik chora-tadbirlari. Atmosfera havosini gaz-simon ifloslantirivchilardan tozalash usullari.</w:t>
             </w:r>
             <w:r>
               <w:rPr>
@@ -8657,7 +8638,7 @@
                 <w:color w:val="000000"/>
                 <w:sz w:val="28"/>
               </w:rPr>
-              <w:t xml:space="preserve">Methods for purifying atmospheric air  dust. Effective methods and equipment for dust removal. Devices used in industrial enterprises for cleaning air  various types </w:t>
+              <w:t>Atmosfera havosini changdan tozalash usullari. Havoni tozalashning samarali usullari va jihozlari</w:t>
             </w:r>
             <w:r>
               <w:rPr>
@@ -8807,7 +8788,7 @@
                 <w:color w:val="000000"/>
                 <w:sz w:val="28"/>
               </w:rPr>
-              <w:t xml:space="preserve">changdan — chang yig'gichlar va filtrlar; quruq, ho'l, moyli va elektr usullari yordamida havoni tozalash. [2,5,6] </w:t>
+              <w:t>changdan — chang yig'gichlar va filtrlar; quruq, ho'l, moyli va elektr usullari yordamida havoni tozalash.</w:t>
             </w:r>
             <w:r>
               <w:rPr>
@@ -8907,7 +8888,7 @@
                 <w:color w:val="000000"/>
                 <w:sz w:val="28"/>
               </w:rPr>
-              <w:t xml:space="preserve">L10 The hydrosphere and its problems. The role and significance  water in nature. The overall state  water resources in  Republic  Uzbekistan. </w:t>
+              <w:t>L10 Gidrosfera va uning muammolari. Suvning tabiat va odamlar hayotidagi o'rni va ahamiyati.</w:t>
             </w:r>
             <w:r>
               <w:rPr>
@@ -8945,7 +8926,7 @@
                 <w:color w:val="000000"/>
                 <w:sz w:val="28"/>
               </w:rPr>
-              <w:t xml:space="preserve">Insufficient provision   population with drinking water. Improving water supply. The Aral Sea problem. </w:t>
+              <w:t xml:space="preserve">Insufficient provision of the population with drinking </w:t>
             </w:r>
             <w:r>
               <w:rPr>
@@ -8955,6 +8936,7 @@
                 <w:color w:val="000000"/>
                 <w:sz w:val="28"/>
               </w:rPr>
+              <w:t xml:space="preserve">water. Improving water supply. The Aral Sea problem. </w:t>
             </w:r>
           </w:p>
           <w:p>
@@ -9084,7 +9066,7 @@
                 <w:color w:val="000000"/>
                 <w:sz w:val="28"/>
               </w:rPr>
-              <w:t xml:space="preserve">Wastewater and its types. Classification  industrial wastewater according to its various characteristics. Methods for treating wastewater (mechanical, physico-chemical, chemical and biological methods). </w:t>
+              <w:t>Oqava suvlar va ularning turlari. Sanoat oqava suvlarini tarkibiga ko'ra tasniflash.</w:t>
             </w:r>
             <w:r>
               <w:rPr>
@@ -9241,7 +9223,7 @@
                 <w:color w:val="000000"/>
                 <w:sz w:val="28"/>
               </w:rPr>
-              <w:t xml:space="preserve">Litosfera. Tuproq, uning tirik organizmlar hayotidagi ahamiyati va o'rni. Soil erosion and ways to combat it. Natural and artificial erosion, water and wind erosion. </w:t>
+              <w:t>Litosfera. Tuproq, uning tirik organizmlar hayotidagi ahamiyati va o'rni.</w:t>
             </w:r>
             <w:r>
               <w:rPr>
@@ -9389,9 +9371,7 @@
                 <w:color w:val="000000"/>
                 <w:sz w:val="28"/>
               </w:rPr>
-              <w:t xml:space="preserve">Atr-muhit holatini monitoring qilish. Monitoringning tushunci, usullari va turlari. Environmental </w:t>
-              <w:br/>
-              <w:t xml:space="preserve">monitoring and its objectives. Economic mechanisms  nature conservation. State ecological expertise. [2,5] </w:t>
+              <w:t>Atrof-muhit holatini monitoring qilish. Monitoringning tushunchasi, usullari va turlari.</w:t>
             </w:r>
             <w:r>
               <w:rPr>
@@ -9529,7 +9509,7 @@
                 <w:color w:val="000000"/>
                 <w:sz w:val="28"/>
               </w:rPr>
-              <w:t xml:space="preserve">L14 Ekologiya va xalqaro hamkorlik. Tabiat va xalqaro hamkorlik. The concept  environmental management and sustainable development. [2] </w:t>
+              <w:t>L14 Ekologiya va xalqaro hamkorlik. Tabiat va xalqaro hamkorlik.</w:t>
             </w:r>
             <w:r>
               <w:rPr>
@@ -9657,7 +9637,7 @@
                 <w:color w:val="000000"/>
                 <w:sz w:val="28"/>
               </w:rPr>
-              <w:t xml:space="preserve">International environmental organizations. International </w:t>
+              <w:t>Xalqaro ekologik tashkilotlar. Xalqaro ekologik tashkilotlar va ularning faoliyati.</w:t>
             </w:r>
             <w:r>
               <w:rPr>
@@ -9667,7 +9647,6 @@
                 <w:color w:val="000000"/>
                 <w:sz w:val="28"/>
               </w:rPr>
-              <w:t xml:space="preserve">environmental organizations, conferences and funds. </w:t>
             </w:r>
           </w:p>
           <w:p>
@@ -9745,7 +9724,7 @@
           <w:color w:val="000000"/>
           <w:sz w:val="28"/>
         </w:rPr>
-        <w:t>Amaliy mashg'ulotlar (A) — 16 soat</w:t>
+        <w:t>Amaliy mashg'ulotlar (A)</w:t>
       </w:r>
     </w:p>
     <w:tbl>
@@ -9961,9 +9940,7 @@
                 <w:color w:val="000000"/>
                 <w:sz w:val="28"/>
               </w:rPr>
-              <w:t xml:space="preserve">Atmosfera havosida mavjud bo'lgan zararli </w:t>
-              <w:br/>
-              <w:t xml:space="preserve">substances Cm present in atmospheric air (taking into account  background concentration Cf  substances that are always present) and  maximum permissible emission (MPE) standards (CO2, NO2, SO2, dust). </w:t>
+              <w:t>Atmosfera havosida mavjud bo'lgan zararli moddalar Cm ning emissiya manbasidan istalgan masofadagi haqiqiy konsentratsiyasini hisoblash.</w:t>
             </w:r>
             <w:r/>
             <w:r>
@@ -10110,7 +10087,7 @@
                 <w:color w:val="000000"/>
                 <w:sz w:val="28"/>
               </w:rPr>
-              <w:t xml:space="preserve">Calculating dust dispersed into  atmosphere and its maximum permissible emission standards. </w:t>
+              <w:t>Atmosferaga tarqalgan changni va uning ruxsat etilgan maksimal chiqindilarini hisoblash.</w:t>
             </w:r>
             <w:r>
               <w:rPr>
@@ -10229,7 +10206,7 @@
                 <w:color w:val="000000"/>
                 <w:sz w:val="28"/>
               </w:rPr>
-              <w:t xml:space="preserve">Calculating  mass quantity M (g/sec)  harmful gases emitted in bulk into  atmosphere and  maximum permissible emission standards  all ir components (CO2, NO2, SO2, NH3). </w:t>
+              <w:t>Atmosferaga ommaviy ravishda chiqarilayotgan zararli gazlarning M (g/sek) massa miqdorini hisoblash.</w:t>
             </w:r>
             <w:r>
               <w:rPr>
@@ -10407,7 +10384,7 @@
                 <w:color w:val="000000"/>
                 <w:sz w:val="28"/>
               </w:rPr>
-              <w:t xml:space="preserve">Yoqilg'i tarkibiga asosan hosil bo'ladigan tutun gazlari miqdorini hisoblash. </w:t>
+              <w:t>Yoqilg'i tarkibiga asosan hosil bo'ladigan tutun gazlari miqdorini hisoblash.</w:t>
             </w:r>
             <w:r>
               <w:rPr>
@@ -10526,7 +10503,7 @@
                 <w:color w:val="000000"/>
                 <w:sz w:val="28"/>
               </w:rPr>
-              <w:t xml:space="preserve">Siklonni (chang ajratgichni) hisoblash va tanlash. </w:t>
+              <w:t>Siklonni (chang ajratgichni) hisoblash va tanlash.</w:t>
             </w:r>
           </w:p>
         </w:tc>
@@ -10636,7 +10613,7 @@
                 <w:color w:val="000000"/>
                 <w:sz w:val="28"/>
               </w:rPr>
-              <w:t xml:space="preserve">Chang va gaz chiqindilarini tozalashga qaratilgan chora-tadbirlarning iqtisodiy samaradorligini hisoblash. </w:t>
+              <w:t>Chang va gaz chiqindilarini tozalashga qaratilgan chora-tadbirlarning iqtisodiy samaradorligini hisoblash.</w:t>
             </w:r>
             <w:r>
               <w:rPr>
@@ -10755,7 +10732,7 @@
                 <w:color w:val="000000"/>
                 <w:sz w:val="28"/>
               </w:rPr>
-              <w:t xml:space="preserve">Ifloslantirivchi moddaning suv havzalariga tashlanishi natijasida yetkazilgan zararni hisoblash. </w:t>
+              <w:t>Ifloslantirivchi moddaning suv havzalariga tashlanishi natijasida yetkazilgan zararni hisoblash.</w:t>
             </w:r>
             <w:r>
               <w:rPr>
@@ -10874,7 +10851,7 @@
                 <w:color w:val="000000"/>
                 <w:sz w:val="28"/>
               </w:rPr>
-              <w:t xml:space="preserve">Oqava suvlarni tozalash darajasini hisoblash. </w:t>
+              <w:t>Oqava suvlarni tozalash darajasini hisoblash.</w:t>
             </w:r>
           </w:p>
         </w:tc>
@@ -10932,7 +10909,7 @@
           <w:color w:val="000000"/>
           <w:sz w:val="28"/>
         </w:rPr>
-        <w:t>Laboratoriya mashg'ulotlari (Lab) — 14 soat</w:t>
+        <w:t>Laboratoriya mashg'ulotlari (Lab)</w:t>
       </w:r>
     </w:p>
     <w:tbl>
@@ -11158,7 +11135,7 @@
                 <w:color w:val="000000"/>
                 <w:sz w:val="28"/>
               </w:rPr>
-              <w:t xml:space="preserve">Oqava suvlar loyqaligini taxminiy aniqlash. </w:t>
+              <w:t>Oqava suvlar loyqaligini taxminiy aniqlash.</w:t>
             </w:r>
           </w:p>
         </w:tc>
@@ -11278,7 +11255,7 @@
                 <w:color w:val="000000"/>
                 <w:sz w:val="28"/>
               </w:rPr>
-              <w:t xml:space="preserve">Gorizontal cho'ktirish havzalarining texnologik parametrlarini aniqlash. </w:t>
+              <w:t>Gorizontal cho'ktirish havzalarining texnologik parametrlarini aniqlash.</w:t>
             </w:r>
             <w:r>
               <w:rPr>
@@ -11407,7 +11384,7 @@
                 <w:color w:val="000000"/>
                 <w:sz w:val="28"/>
               </w:rPr>
-              <w:t xml:space="preserve">Determining  amount  suspended solids in wastewater tomonidan filtration through a filter using  gravimetric method. </w:t>
+              <w:t>Oqava suvlardagi muallaq qattiq moddalar miqdorini qog'oz filtr orqali filtrlash usulida aniqlash.</w:t>
             </w:r>
             <w:r>
               <w:rPr>
@@ -11545,7 +11522,7 @@
                 <w:color w:val="000000"/>
                 <w:sz w:val="28"/>
               </w:rPr>
-              <w:t xml:space="preserve">Oqava suvlarni tozalashning fizik-kimyoviy usullari. </w:t>
+              <w:t>Oqava suvlarni tozalashning fizik-kimyoviy usullari.</w:t>
             </w:r>
           </w:p>
         </w:tc>
@@ -11665,7 +11642,7 @@
                 <w:color w:val="000000"/>
                 <w:sz w:val="28"/>
               </w:rPr>
-              <w:t xml:space="preserve">Oqava suvlarni adsorbsiya usuli bilan organik moddalardan tozalash. </w:t>
+              <w:t>Oqava suvlarni adsorbsiya usuli bilan organik moddalardan tozalash.</w:t>
             </w:r>
             <w:r>
               <w:rPr>
@@ -11794,7 +11771,7 @@
                 <w:color w:val="000000"/>
                 <w:sz w:val="28"/>
               </w:rPr>
-              <w:t xml:space="preserve">Biogaz olish. </w:t>
+              <w:t>Biogaz olish.</w:t>
             </w:r>
           </w:p>
         </w:tc>
@@ -11914,7 +11891,7 @@
                 <w:color w:val="000000"/>
                 <w:sz w:val="28"/>
               </w:rPr>
-              <w:t xml:space="preserve">Gaz chiqindilarining tarkibini organoleptik aniqlash. </w:t>
+              <w:t>Gaz chiqindilarining tarkibini organoleptik aniqlash.</w:t>
             </w:r>
             <w:r>
               <w:rPr>
@@ -12054,7 +12031,7 @@
                 <w:color w:val="000000"/>
                 <w:sz w:val="28"/>
               </w:rPr>
-              <w:t>6. Mustaqil ta'lim topshiriqlari — 60 soat</w:t>
+              <w:t>6. Mustaqil ta'lim topshiriqlari</w:t>
             </w:r>
           </w:p>
         </w:tc>
@@ -12281,7 +12258,7 @@
                 <w:color w:val="000000"/>
                 <w:sz w:val="28"/>
               </w:rPr>
-              <w:t xml:space="preserve">Chang va gaz tozalash uskunalarining ishlash ko'rsatkichlarini jadval shaklida tahlil qilish. </w:t>
+              <w:t>Chang va gaz tozalash uskunalarining ishlash ko'rsatkichlarini jadval shaklida tahlil qilish.</w:t>
             </w:r>
             <w:r>
               <w:rPr>
@@ -12411,7 +12388,7 @@
                 <w:color w:val="000000"/>
                 <w:sz w:val="28"/>
               </w:rPr>
-              <w:t xml:space="preserve">Developing an action plan for obtaining secondary </w:t>
+              <w:t>Sanoat chiqindilaridan ikkilamchi mahsulotlar olish bo'yicha harakat rejasini ishlab chiqish.</w:t>
             </w:r>
             <w:r>
               <w:rPr>
@@ -12421,7 +12398,6 @@
                 <w:color w:val="000000"/>
                 <w:sz w:val="28"/>
               </w:rPr>
-              <w:t xml:space="preserve">products from industrial waste, and defending it. </w:t>
             </w:r>
           </w:p>
         </w:tc>
@@ -12542,7 +12518,7 @@
                 <w:color w:val="000000"/>
                 <w:sz w:val="28"/>
               </w:rPr>
-              <w:t xml:space="preserve">Developing a comprehensive plan  measures for managing industrial waste according to its composition (using  example  a particular production facility). </w:t>
+              <w:t>Sanoat chiqindilarini toifalarga ko'ra boshqarish bo'yicha chora-tadbirlarning kompleks rejasini ishlab chiqish.</w:t>
             </w:r>
             <w:r>
               <w:rPr>
@@ -12681,7 +12657,7 @@
                 <w:color w:val="000000"/>
                 <w:sz w:val="28"/>
               </w:rPr>
-              <w:t xml:space="preserve">Environmental safety and monitoring. Analyzing and </w:t>
+              <w:t>Ekologik xavfsizlik va monitoring. Ekologik xavflarni tahlil qilish va baholash.</w:t>
             </w:r>
             <w:r>
               <w:rPr>
@@ -12691,7 +12667,6 @@
                 <w:color w:val="000000"/>
                 <w:sz w:val="28"/>
               </w:rPr>
-              <w:t xml:space="preserve">assessing environmental risks in industry. </w:t>
             </w:r>
           </w:p>
         </w:tc>
@@ -12812,7 +12787,7 @@
                 <w:color w:val="000000"/>
                 <w:sz w:val="28"/>
               </w:rPr>
-              <w:t xml:space="preserve">Collecting information on pollutants accidentally (or </w:t>
+              <w:t>Mavjud korxonalardan atrof-muhitga tasodifan (yoki bir vaqtda) chiqarilayotgan ifloslantirivchi moddalar haqida ma'lumot to'plash.</w:t>
             </w:r>
             <w:r>
               <w:rPr>
@@ -12822,7 +12797,6 @@
                 <w:color w:val="000000"/>
                 <w:sz w:val="28"/>
               </w:rPr>
-              <w:t xml:space="preserve">simultaneously) discharged into water bodies and onto </w:t>
             </w:r>
             <w:r>
               <w:rPr>
@@ -12832,7 +12806,6 @@
                 <w:color w:val="000000"/>
                 <w:sz w:val="28"/>
               </w:rPr>
-              <w:t xml:space="preserve">land. </w:t>
             </w:r>
           </w:p>
         </w:tc>
@@ -12953,7 +12926,7 @@
                 <w:color w:val="000000"/>
                 <w:sz w:val="28"/>
               </w:rPr>
-              <w:t xml:space="preserve">Hosil bo'lgan qattiq maishiy chiqindilar va ularni yo'q qilish bo'yicha ma'lumotnoma tayyorlash. </w:t>
+              <w:t>Hosil bo'lgan qattiq maishiy chiqindilar va ularni yo'q qilish bo'yicha ma'lumotnoma tayyorlash.</w:t>
             </w:r>
             <w:r>
               <w:rPr>
@@ -13031,7 +13004,7 @@
           <w:color w:val="000000"/>
           <w:sz w:val="28"/>
         </w:rPr>
-        <w:t>* Note: The independent work assignments performed tomonidan students for  subject (module) must be  a varied nature. One-third   independent work assignments must be designed for cooperative work in small groups.</w:t>
+        <w:t>* Eslatma: Talabalar tomonidan fan (modul) bo'yicha bajariladigan mustaqil ish topshiriqlari xilma-xil xarakterda bo'lishi kerak. Mustaqil ish topshiriqlarining uchdan bir qismi 2-3 talabadan iborat guruhlarda hamkorlikda ishlash uchun mo'ljallangan bo'lishi kerak.</w:t>
       </w:r>
       <w:r>
         <w:rPr>
@@ -13121,17 +13094,7 @@
           <w:color w:val="000000"/>
           <w:sz w:val="28"/>
         </w:rPr>
-        <w:t xml:space="preserve"> ma'ruzalar; </w:t>
-        <w:br/>
-        <w:t xml:space="preserve"> amaliy va laboratoriya ishlarini bajarish va xulosalar chiqarish;  interaktiv keys-stadlar; </w:t>
-        <w:br/>
-        <w:t xml:space="preserve"> tezkor (blits) so'rovlar; </w:t>
-        <w:br/>
-        <w:t xml:space="preserve"> guruh ishi; </w:t>
-        <w:br/>
-        <w:t xml:space="preserve"> taqdimotlar berish; </w:t>
-        <w:br/>
-        <w:t xml:space="preserve"> projects for teamwork and defense. </w:t>
+        <w:t></w:t>
       </w:r>
       <w:r>
         <w:rPr>
@@ -13141,8 +13104,11 @@
           <w:color w:val="000000"/>
           <w:sz w:val="28"/>
         </w:rPr>
-      </w:r>
-      <w:r/>
+        <w:t xml:space="preserve"> lectures; </w:t>
+      </w:r>
+      <w:r>
+        <w:br/>
+      </w:r>
       <w:r>
         <w:rPr>
           <w:rFonts w:ascii="Symbol" w:hAnsi="Symbol" w:eastAsia="Symbol"/>
@@ -13151,6 +13117,7 @@
           <w:color w:val="000000"/>
           <w:sz w:val="28"/>
         </w:rPr>
+        <w:t></w:t>
       </w:r>
       <w:r>
         <w:rPr>
@@ -13160,6 +13127,7 @@
           <w:color w:val="000000"/>
           <w:sz w:val="28"/>
         </w:rPr>
+        <w:t xml:space="preserve"> performing and drawing conclusions from practical and laboratory work; </w:t>
       </w:r>
       <w:r>
         <w:rPr>
@@ -13169,6 +13137,7 @@
           <w:color w:val="000000"/>
           <w:sz w:val="28"/>
         </w:rPr>
+        <w:t></w:t>
       </w:r>
       <w:r>
         <w:rPr>
@@ -13178,8 +13147,11 @@
           <w:color w:val="000000"/>
           <w:sz w:val="28"/>
         </w:rPr>
-      </w:r>
-      <w:r/>
+        <w:t xml:space="preserve"> interactive case studies; </w:t>
+      </w:r>
+      <w:r>
+        <w:br/>
+      </w:r>
       <w:r>
         <w:rPr>
           <w:rFonts w:ascii="Symbol" w:hAnsi="Symbol" w:eastAsia="Symbol"/>
@@ -13188,6 +13160,7 @@
           <w:color w:val="000000"/>
           <w:sz w:val="28"/>
         </w:rPr>
+        <w:t></w:t>
       </w:r>
       <w:r>
         <w:rPr>
@@ -13197,8 +13170,11 @@
           <w:color w:val="000000"/>
           <w:sz w:val="28"/>
         </w:rPr>
-      </w:r>
-      <w:r/>
+        <w:t xml:space="preserve"> rapid-fire (blitz) surveys; </w:t>
+      </w:r>
+      <w:r>
+        <w:br/>
+      </w:r>
       <w:r>
         <w:rPr>
           <w:rFonts w:ascii="Symbol" w:hAnsi="Symbol" w:eastAsia="Symbol"/>
@@ -13207,6 +13183,7 @@
           <w:color w:val="000000"/>
           <w:sz w:val="28"/>
         </w:rPr>
+        <w:t></w:t>
       </w:r>
       <w:r>
         <w:rPr>
@@ -13216,8 +13193,11 @@
           <w:color w:val="000000"/>
           <w:sz w:val="28"/>
         </w:rPr>
-      </w:r>
-      <w:r/>
+        <w:t xml:space="preserve"> group work; </w:t>
+      </w:r>
+      <w:r>
+        <w:br/>
+      </w:r>
       <w:r>
         <w:rPr>
           <w:rFonts w:ascii="Symbol" w:hAnsi="Symbol" w:eastAsia="Symbol"/>
@@ -13226,6 +13206,7 @@
           <w:color w:val="000000"/>
           <w:sz w:val="28"/>
         </w:rPr>
+        <w:t></w:t>
       </w:r>
       <w:r>
         <w:rPr>
@@ -13235,8 +13216,11 @@
           <w:color w:val="000000"/>
           <w:sz w:val="28"/>
         </w:rPr>
-      </w:r>
-      <w:r/>
+        <w:t xml:space="preserve"> giving presentations; </w:t>
+      </w:r>
+      <w:r>
+        <w:br/>
+      </w:r>
       <w:r>
         <w:rPr>
           <w:rFonts w:ascii="Symbol" w:hAnsi="Symbol" w:eastAsia="Symbol"/>
@@ -13245,6 +13229,7 @@
           <w:color w:val="000000"/>
           <w:sz w:val="28"/>
         </w:rPr>
+        <w:t></w:t>
       </w:r>
       <w:r>
         <w:rPr>
@@ -13254,6 +13239,7 @@
           <w:color w:val="000000"/>
           <w:sz w:val="28"/>
         </w:rPr>
+        <w:t xml:space="preserve"> projects for teamwork and defense. </w:t>
       </w:r>
     </w:p>
     <w:tbl>
@@ -13325,7 +13311,7 @@
           <w:color w:val="000000"/>
           <w:sz w:val="28"/>
         </w:rPr>
-        <w:t xml:space="preserve">Fully mastering  oretical and methodical concepts related to  subject, being able to correctly reflect  results  analysis, conducting independent reasoning about  processes being studied, completing  tasks and assignments given for control, and submitting a written paper for  final assessment. </w:t>
+        <w:t>Fanga oid nazariy va uslubiy tushunchalarni to'liq o'zlashtirish, tahlil natijalarini to'g'ri aks ettirish qobiliyatiga ega bo'lish, o'rganiladigan jarayonlar haqida mustaqil fikr yuritish, olingan bilimlarni amaliyotga qo'llash va ma'lumotnoma hamda qo'shimcha adabiyotlardan yaxshi xabardor bo'lish.</w:t>
       </w:r>
       <w:r>
         <w:rPr>
@@ -13452,7 +13438,7 @@
           <w:color w:val="000000"/>
           <w:sz w:val="28"/>
         </w:rPr>
-        <w:t>a) To receive a grade  5 (excellent), a student’s level  knowledge must meet  following:</w:t>
+        <w:t>a) 5 (a'lo) baho olish uchun talabaning bilim darajasi quyidagilarga javob berishi kerak:</w:t>
       </w:r>
       <w:r>
         <w:rPr>
@@ -13484,27 +13470,7 @@
           <w:color w:val="000000"/>
           <w:sz w:val="28"/>
         </w:rPr>
-        <w:t xml:space="preserve"> fan mohiyati va mazmunini to'liq ochib beradi; </w:t>
-        <w:br/>
-        <w:t xml:space="preserve"> fan mavzularini ilmiy qat'iylik va mantiqni saqlagan holda bayon etadi, </w:t>
-        <w:tab/>
-        <w:t xml:space="preserve">ilmiy xatoliklarga yoki chalkashliklarga yo'l qo'ymaydi; </w:t>
-        <w:br/>
-        <w:t xml:space="preserve">  a clear understanding   oretical or practical significance   </w:t>
-        <w:tab/>
-        <w:t xml:space="preserve">subject’s topic materials; </w:t>
-        <w:br/>
-        <w:t xml:space="preserve"> demonstrates  ability to think freely and independently within  subject;  gives clear and concise answers to  questions asked; </w:t>
-        <w:br/>
-        <w:t xml:space="preserve"> is thoroughly prepared with lecture notes; </w:t>
-        <w:br/>
-        <w:t xml:space="preserve">  completed independent assignments fully and accurately; </w:t>
-        <w:br/>
-        <w:t xml:space="preserve">  mastered all practical skills and abilities; </w:t>
-        <w:br/>
-        <w:t xml:space="preserve"> is able to apply oretical knowledge in various situations; </w:t>
-        <w:br/>
-        <w:t xml:space="preserve"> follows a systematic approach and maintains continuity. </w:t>
+        <w:t></w:t>
       </w:r>
       <w:r>
         <w:rPr>
@@ -13514,8 +13480,11 @@
           <w:color w:val="000000"/>
           <w:sz w:val="28"/>
         </w:rPr>
-      </w:r>
-      <w:r/>
+        <w:t xml:space="preserve"> fully reveals the essence and content of the subject; </w:t>
+      </w:r>
+      <w:r>
+        <w:br/>
+      </w:r>
       <w:r>
         <w:rPr>
           <w:rFonts w:ascii="Symbol" w:hAnsi="Symbol" w:eastAsia="Symbol"/>
@@ -13524,6 +13493,7 @@
           <w:color w:val="000000"/>
           <w:sz w:val="28"/>
         </w:rPr>
+        <w:t></w:t>
       </w:r>
       <w:r>
         <w:rPr>
@@ -13533,8 +13503,11 @@
           <w:color w:val="000000"/>
           <w:sz w:val="28"/>
         </w:rPr>
-      </w:r>
-      <w:r/>
+        <w:t xml:space="preserve"> presents the topics of the subject while maintaining scientific rigor and logic, </w:t>
+      </w:r>
+      <w:r>
+        <w:tab/>
+      </w:r>
       <w:r>
         <w:rPr>
           <w:rFonts w:ascii="Arial" w:hAnsi="Arial" w:eastAsia="Arial"/>
@@ -13543,8 +13516,11 @@
           <w:color w:val="000000"/>
           <w:sz w:val="28"/>
         </w:rPr>
-      </w:r>
-      <w:r/>
+        <w:t xml:space="preserve">without allowing scientific errors or confusion; </w:t>
+      </w:r>
+      <w:r>
+        <w:br/>
+      </w:r>
       <w:r>
         <w:rPr>
           <w:rFonts w:ascii="Symbol" w:hAnsi="Symbol" w:eastAsia="Symbol"/>
@@ -13553,6 +13529,7 @@
           <w:color w:val="000000"/>
           <w:sz w:val="28"/>
         </w:rPr>
+        <w:t></w:t>
       </w:r>
       <w:r>
         <w:rPr>
@@ -13562,8 +13539,11 @@
           <w:color w:val="000000"/>
           <w:sz w:val="28"/>
         </w:rPr>
-      </w:r>
-      <w:r/>
+        <w:t xml:space="preserve"> has a clear understanding of the theoretical or practical significance of the </w:t>
+      </w:r>
+      <w:r>
+        <w:tab/>
+      </w:r>
       <w:r>
         <w:rPr>
           <w:rFonts w:ascii="Arial" w:hAnsi="Arial" w:eastAsia="Arial"/>
@@ -13572,8 +13552,11 @@
           <w:color w:val="000000"/>
           <w:sz w:val="28"/>
         </w:rPr>
-      </w:r>
-      <w:r/>
+        <w:t xml:space="preserve">subject’s topic materials; </w:t>
+      </w:r>
+      <w:r>
+        <w:br/>
+      </w:r>
       <w:r>
         <w:rPr>
           <w:rFonts w:ascii="Symbol" w:hAnsi="Symbol" w:eastAsia="Symbol"/>
@@ -13582,6 +13565,7 @@
           <w:color w:val="000000"/>
           <w:sz w:val="28"/>
         </w:rPr>
+        <w:t></w:t>
       </w:r>
       <w:r>
         <w:rPr>
@@ -13591,6 +13575,7 @@
           <w:color w:val="000000"/>
           <w:sz w:val="28"/>
         </w:rPr>
+        <w:t xml:space="preserve"> demonstrates the ability to think freely and independently within the subject; </w:t>
       </w:r>
       <w:r>
         <w:rPr>
@@ -13600,6 +13585,7 @@
           <w:color w:val="000000"/>
           <w:sz w:val="28"/>
         </w:rPr>
+        <w:t></w:t>
       </w:r>
       <w:r>
         <w:rPr>
@@ -13609,8 +13595,11 @@
           <w:color w:val="000000"/>
           <w:sz w:val="28"/>
         </w:rPr>
-      </w:r>
-      <w:r/>
+        <w:t xml:space="preserve"> gives clear and concise answers to the questions asked; </w:t>
+      </w:r>
+      <w:r>
+        <w:br/>
+      </w:r>
       <w:r>
         <w:rPr>
           <w:rFonts w:ascii="Symbol" w:hAnsi="Symbol" w:eastAsia="Symbol"/>
@@ -13619,6 +13608,7 @@
           <w:color w:val="000000"/>
           <w:sz w:val="28"/>
         </w:rPr>
+        <w:t></w:t>
       </w:r>
       <w:r>
         <w:rPr>
@@ -13628,8 +13618,11 @@
           <w:color w:val="000000"/>
           <w:sz w:val="28"/>
         </w:rPr>
-      </w:r>
-      <w:r/>
+        <w:t xml:space="preserve"> is thoroughly prepared with lecture notes; </w:t>
+      </w:r>
+      <w:r>
+        <w:br/>
+      </w:r>
       <w:r>
         <w:rPr>
           <w:rFonts w:ascii="Symbol" w:hAnsi="Symbol" w:eastAsia="Symbol"/>
@@ -13638,6 +13631,7 @@
           <w:color w:val="000000"/>
           <w:sz w:val="28"/>
         </w:rPr>
+        <w:t></w:t>
       </w:r>
       <w:r>
         <w:rPr>
@@ -13647,8 +13641,11 @@
           <w:color w:val="000000"/>
           <w:sz w:val="28"/>
         </w:rPr>
-      </w:r>
-      <w:r/>
+        <w:t xml:space="preserve"> has completed independent assignments fully and accurately; </w:t>
+      </w:r>
+      <w:r>
+        <w:br/>
+      </w:r>
       <w:r>
         <w:rPr>
           <w:rFonts w:ascii="Symbol" w:hAnsi="Symbol" w:eastAsia="Symbol"/>
@@ -13657,6 +13654,7 @@
           <w:color w:val="000000"/>
           <w:sz w:val="28"/>
         </w:rPr>
+        <w:t></w:t>
       </w:r>
       <w:r>
         <w:rPr>
@@ -13666,8 +13664,11 @@
           <w:color w:val="000000"/>
           <w:sz w:val="28"/>
         </w:rPr>
-      </w:r>
-      <w:r/>
+        <w:t xml:space="preserve"> has mastered all practical skills and abilities; </w:t>
+      </w:r>
+      <w:r>
+        <w:br/>
+      </w:r>
       <w:r>
         <w:rPr>
           <w:rFonts w:ascii="Symbol" w:hAnsi="Symbol" w:eastAsia="Symbol"/>
@@ -13676,6 +13677,7 @@
           <w:color w:val="000000"/>
           <w:sz w:val="28"/>
         </w:rPr>
+        <w:t></w:t>
       </w:r>
       <w:r>
         <w:rPr>
@@ -13685,8 +13687,11 @@
           <w:color w:val="000000"/>
           <w:sz w:val="28"/>
         </w:rPr>
-      </w:r>
-      <w:r/>
+        <w:t xml:space="preserve"> is able to apply theoretical knowledge in various situations; </w:t>
+      </w:r>
+      <w:r>
+        <w:br/>
+      </w:r>
       <w:r>
         <w:rPr>
           <w:rFonts w:ascii="Symbol" w:hAnsi="Symbol" w:eastAsia="Symbol"/>
@@ -13695,6 +13700,7 @@
           <w:color w:val="000000"/>
           <w:sz w:val="28"/>
         </w:rPr>
+        <w:t></w:t>
       </w:r>
       <w:r>
         <w:rPr>
@@ -13704,6 +13710,7 @@
           <w:color w:val="000000"/>
           <w:sz w:val="28"/>
         </w:rPr>
+        <w:t xml:space="preserve"> follows a systematic approach and maintains continuity. </w:t>
       </w:r>
     </w:p>
     <w:p>
@@ -13723,7 +13730,7 @@
           <w:color w:val="000000"/>
           <w:sz w:val="28"/>
         </w:rPr>
-        <w:t>b) To receive a grade  4 (good), a student’s level  knowledge must meet  following:</w:t>
+        <w:t>b) 4 (yaxshi) baho olish uchun talabaning bilim darajasi quyidagilarga javob berishi kerak:</w:t>
       </w:r>
       <w:r>
         <w:rPr>
@@ -13755,23 +13762,7 @@
           <w:color w:val="000000"/>
           <w:sz w:val="28"/>
         </w:rPr>
-        <w:t xml:space="preserve"> fan mohiyati va mazmunini tushunadi va </w:t>
-        <w:tab/>
-        <w:t xml:space="preserve">mavzularni bayon etishda ilmiy yoki mantiqiy chalkashlikka yo'l qo'ymaydi; </w:t>
-        <w:br/>
-        <w:t xml:space="preserve"> fan mazmunining amaliy ahamiyatini tushunadi; </w:t>
-        <w:br/>
-        <w:t xml:space="preserve"> completes  assigned tasks and assignments within  scope   </w:t>
-        <w:tab/>
-        <w:t xml:space="preserve">o'quv dasturi; </w:t>
-        <w:br/>
-        <w:t xml:space="preserve"> correctly answers  questions asked on  subject; </w:t>
-        <w:br/>
-        <w:t xml:space="preserve">  thoroughly compiled lecture notes on  subject; </w:t>
-        <w:br/>
-        <w:t xml:space="preserve">  fully completed  independent assignments on  subject; </w:t>
-        <w:br/>
-        <w:t xml:space="preserve">  made an effort to master all practical skills and abilities. </w:t>
+        <w:t></w:t>
       </w:r>
       <w:r>
         <w:rPr>
@@ -13781,8 +13772,11 @@
           <w:color w:val="000000"/>
           <w:sz w:val="28"/>
         </w:rPr>
-      </w:r>
-      <w:r/>
+        <w:t xml:space="preserve"> understands the essence and content of the subject and does not allow </w:t>
+      </w:r>
+      <w:r>
+        <w:tab/>
+      </w:r>
       <w:r>
         <w:rPr>
           <w:rFonts w:ascii="Arial" w:hAnsi="Arial" w:eastAsia="Arial"/>
@@ -13791,8 +13785,11 @@
           <w:color w:val="000000"/>
           <w:sz w:val="28"/>
         </w:rPr>
-      </w:r>
-      <w:r/>
+        <w:t xml:space="preserve">scientific or logical confusion in presenting the topics; </w:t>
+      </w:r>
+      <w:r>
+        <w:br/>
+      </w:r>
       <w:r>
         <w:rPr>
           <w:rFonts w:ascii="Symbol" w:hAnsi="Symbol" w:eastAsia="Symbol"/>
@@ -13801,6 +13798,7 @@
           <w:color w:val="000000"/>
           <w:sz w:val="28"/>
         </w:rPr>
+        <w:t></w:t>
       </w:r>
       <w:r>
         <w:rPr>
@@ -13810,8 +13808,11 @@
           <w:color w:val="000000"/>
           <w:sz w:val="28"/>
         </w:rPr>
-      </w:r>
-      <w:r/>
+        <w:t xml:space="preserve"> understands the practical significance of the content of the subject; </w:t>
+      </w:r>
+      <w:r>
+        <w:br/>
+      </w:r>
       <w:r>
         <w:rPr>
           <w:rFonts w:ascii="Symbol" w:hAnsi="Symbol" w:eastAsia="Symbol"/>
@@ -13820,6 +13821,7 @@
           <w:color w:val="000000"/>
           <w:sz w:val="28"/>
         </w:rPr>
+        <w:t></w:t>
       </w:r>
       <w:r>
         <w:rPr>
@@ -13829,8 +13831,11 @@
           <w:color w:val="000000"/>
           <w:sz w:val="28"/>
         </w:rPr>
-      </w:r>
-      <w:r/>
+        <w:t xml:space="preserve"> completes the assigned tasks and assignments within the scope of the </w:t>
+      </w:r>
+      <w:r>
+        <w:tab/>
+      </w:r>
       <w:r>
         <w:rPr>
           <w:rFonts w:ascii="Arial" w:hAnsi="Arial" w:eastAsia="Arial"/>
@@ -13839,8 +13844,11 @@
           <w:color w:val="000000"/>
           <w:sz w:val="28"/>
         </w:rPr>
-      </w:r>
-      <w:r/>
+        <w:t xml:space="preserve">curriculum; </w:t>
+      </w:r>
+      <w:r>
+        <w:br/>
+      </w:r>
       <w:r>
         <w:rPr>
           <w:rFonts w:ascii="Symbol" w:hAnsi="Symbol" w:eastAsia="Symbol"/>
@@ -13849,6 +13857,7 @@
           <w:color w:val="000000"/>
           <w:sz w:val="28"/>
         </w:rPr>
+        <w:t></w:t>
       </w:r>
       <w:r>
         <w:rPr>
@@ -13858,8 +13867,11 @@
           <w:color w:val="000000"/>
           <w:sz w:val="28"/>
         </w:rPr>
-      </w:r>
-      <w:r/>
+        <w:t xml:space="preserve"> correctly answers the questions asked on the subject; </w:t>
+      </w:r>
+      <w:r>
+        <w:br/>
+      </w:r>
       <w:r>
         <w:rPr>
           <w:rFonts w:ascii="Symbol" w:hAnsi="Symbol" w:eastAsia="Symbol"/>
@@ -13868,6 +13880,7 @@
           <w:color w:val="000000"/>
           <w:sz w:val="28"/>
         </w:rPr>
+        <w:t></w:t>
       </w:r>
       <w:r>
         <w:rPr>
@@ -13877,8 +13890,11 @@
           <w:color w:val="000000"/>
           <w:sz w:val="28"/>
         </w:rPr>
-      </w:r>
-      <w:r/>
+        <w:t xml:space="preserve"> has thoroughly compiled lecture notes on the subject; </w:t>
+      </w:r>
+      <w:r>
+        <w:br/>
+      </w:r>
       <w:r>
         <w:rPr>
           <w:rFonts w:ascii="Symbol" w:hAnsi="Symbol" w:eastAsia="Symbol"/>
@@ -13887,6 +13903,7 @@
           <w:color w:val="000000"/>
           <w:sz w:val="28"/>
         </w:rPr>
+        <w:t></w:t>
       </w:r>
       <w:r>
         <w:rPr>
@@ -13896,8 +13913,11 @@
           <w:color w:val="000000"/>
           <w:sz w:val="28"/>
         </w:rPr>
-      </w:r>
-      <w:r/>
+        <w:t xml:space="preserve"> has fully completed the independent assignments on the subject; </w:t>
+      </w:r>
+      <w:r>
+        <w:br/>
+      </w:r>
       <w:r>
         <w:rPr>
           <w:rFonts w:ascii="Symbol" w:hAnsi="Symbol" w:eastAsia="Symbol"/>
@@ -13906,6 +13926,7 @@
           <w:color w:val="000000"/>
           <w:sz w:val="28"/>
         </w:rPr>
+        <w:t></w:t>
       </w:r>
       <w:r>
         <w:rPr>
@@ -13915,6 +13936,7 @@
           <w:color w:val="000000"/>
           <w:sz w:val="28"/>
         </w:rPr>
+        <w:t xml:space="preserve"> has made an effort to master all practical skills and abilities. </w:t>
       </w:r>
     </w:p>
     <w:p>
@@ -13934,7 +13956,7 @@
           <w:color w:val="000000"/>
           <w:sz w:val="28"/>
         </w:rPr>
-        <w:t>c) To receive a grade  3 (satisfactory), a student’s level  knowledge must meet  following:</w:t>
+        <w:t>c) 3 (qoniqarli) baho olish uchun talabaning bilim darajasi quyidagilarga javob berishi kerak:</w:t>
       </w:r>
       <w:r>
         <w:rPr>
@@ -13966,19 +13988,7 @@
           <w:color w:val="000000"/>
           <w:sz w:val="28"/>
         </w:rPr>
-        <w:t xml:space="preserve"> fan haqida umumiy tushunchaga ega; </w:t>
-        <w:br/>
-        <w:t xml:space="preserve"> fan mavzularini tor doirada bayon etadi, bayonida </w:t>
-        <w:tab/>
-        <w:t xml:space="preserve">ba'zi chalkashliklarga yo'l qo'yadi; </w:t>
-        <w:br/>
-        <w:t xml:space="preserve"> fan bo'yicha mustaqil topshiriqlarni to'liq bajargan; </w:t>
-        <w:br/>
-        <w:t xml:space="preserve">  presentation is not fluent; </w:t>
-        <w:br/>
-        <w:t xml:space="preserve"> gives vague and confused answers to questions on  subject; </w:t>
-        <w:br/>
-        <w:t xml:space="preserve">  text on  subject  not  thoroughly composed; </w:t>
+        <w:t></w:t>
       </w:r>
       <w:r>
         <w:rPr>
@@ -13988,8 +13998,11 @@
           <w:color w:val="000000"/>
           <w:sz w:val="28"/>
         </w:rPr>
-      </w:r>
-      <w:r/>
+        <w:t xml:space="preserve"> has a general understanding of the subject; </w:t>
+      </w:r>
+      <w:r>
+        <w:br/>
+      </w:r>
       <w:r>
         <w:rPr>
           <w:rFonts w:ascii="Symbol" w:hAnsi="Symbol" w:eastAsia="Symbol"/>
@@ -13998,6 +14011,7 @@
           <w:color w:val="000000"/>
           <w:sz w:val="28"/>
         </w:rPr>
+        <w:t></w:t>
       </w:r>
       <w:r>
         <w:rPr>
@@ -14007,8 +14021,11 @@
           <w:color w:val="000000"/>
           <w:sz w:val="28"/>
         </w:rPr>
-      </w:r>
-      <w:r/>
+        <w:t xml:space="preserve"> presents the topics of the subject in a narrow scope, allowing some </w:t>
+      </w:r>
+      <w:r>
+        <w:tab/>
+      </w:r>
       <w:r>
         <w:rPr>
           <w:rFonts w:ascii="Arial" w:hAnsi="Arial" w:eastAsia="Arial"/>
@@ -14017,8 +14034,11 @@
           <w:color w:val="000000"/>
           <w:sz w:val="28"/>
         </w:rPr>
-      </w:r>
-      <w:r/>
+        <w:t xml:space="preserve">confusion in the presentation; </w:t>
+      </w:r>
+      <w:r>
+        <w:br/>
+      </w:r>
       <w:r>
         <w:rPr>
           <w:rFonts w:ascii="Symbol" w:hAnsi="Symbol" w:eastAsia="Symbol"/>
@@ -14027,6 +14047,7 @@
           <w:color w:val="000000"/>
           <w:sz w:val="28"/>
         </w:rPr>
+        <w:t></w:t>
       </w:r>
       <w:r>
         <w:rPr>
@@ -14036,8 +14057,11 @@
           <w:color w:val="000000"/>
           <w:sz w:val="28"/>
         </w:rPr>
-      </w:r>
-      <w:r/>
+        <w:t xml:space="preserve"> has fully completed independent assignments on the subject; </w:t>
+      </w:r>
+      <w:r>
+        <w:br/>
+      </w:r>
       <w:r>
         <w:rPr>
           <w:rFonts w:ascii="Symbol" w:hAnsi="Symbol" w:eastAsia="Symbol"/>
@@ -14046,6 +14070,7 @@
           <w:color w:val="000000"/>
           <w:sz w:val="28"/>
         </w:rPr>
+        <w:t></w:t>
       </w:r>
       <w:r>
         <w:rPr>
@@ -14055,8 +14080,11 @@
           <w:color w:val="000000"/>
           <w:sz w:val="28"/>
         </w:rPr>
-      </w:r>
-      <w:r/>
+        <w:t xml:space="preserve"> the presentation is not fluent; </w:t>
+      </w:r>
+      <w:r>
+        <w:br/>
+      </w:r>
       <w:r>
         <w:rPr>
           <w:rFonts w:ascii="Symbol" w:hAnsi="Symbol" w:eastAsia="Symbol"/>
@@ -14065,6 +14093,7 @@
           <w:color w:val="000000"/>
           <w:sz w:val="28"/>
         </w:rPr>
+        <w:t></w:t>
       </w:r>
       <w:r>
         <w:rPr>
@@ -14074,8 +14103,11 @@
           <w:color w:val="000000"/>
           <w:sz w:val="28"/>
         </w:rPr>
-      </w:r>
-      <w:r/>
+        <w:t xml:space="preserve"> gives vague and confused answers to questions on the subject; </w:t>
+      </w:r>
+      <w:r>
+        <w:br/>
+      </w:r>
       <w:r>
         <w:rPr>
           <w:rFonts w:ascii="Symbol" w:hAnsi="Symbol" w:eastAsia="Symbol"/>
@@ -14084,6 +14116,7 @@
           <w:color w:val="000000"/>
           <w:sz w:val="28"/>
         </w:rPr>
+        <w:t></w:t>
       </w:r>
       <w:r>
         <w:rPr>
@@ -14093,6 +14126,7 @@
           <w:color w:val="000000"/>
           <w:sz w:val="28"/>
         </w:rPr>
+        <w:t xml:space="preserve"> the text on the subject has not been thoroughly composed; </w:t>
       </w:r>
     </w:p>
     <w:p>
@@ -14131,7 +14165,7 @@
           <w:color w:val="000000"/>
           <w:sz w:val="28"/>
         </w:rPr>
-        <w:t>d) In  following cases, a student’s level  knowledge may be assessed as unsatisfactory with a grade  2:</w:t>
+        <w:t>d) Quyidagi hollarda talabaning bilim darajasi 2 (qoniqarsiz) baho bilan baholanishi mumkin:</w:t>
       </w:r>
       <w:r>
         <w:rPr>
@@ -14160,15 +14194,7 @@
           <w:color w:val="000000"/>
           <w:sz w:val="28"/>
         </w:rPr>
-        <w:t xml:space="preserve"> fan bo'yicha mashg'ulotlarga tayyorlanmagan; </w:t>
-        <w:br/>
-        <w:t xml:space="preserve"> fan bo'yicha mashg'ulotlarni mutlaqo tushunmaydi; </w:t>
-        <w:br/>
-        <w:t xml:space="preserve"> fan bo'yicha mustaqil topshiriqlarni to'liq bajarmagan; </w:t>
-        <w:br/>
-        <w:t xml:space="preserve"> it is evident that texts on  subject have  copied from ors;  serious errors and confusion have  allowed in  text on  subject;  no answer is obtained to  questions asked on  subject; </w:t>
-        <w:br/>
-        <w:t xml:space="preserve"> does not know  subject. </w:t>
+        <w:t></w:t>
       </w:r>
       <w:r>
         <w:rPr>
@@ -14178,8 +14204,11 @@
           <w:color w:val="000000"/>
           <w:sz w:val="28"/>
         </w:rPr>
-      </w:r>
-      <w:r/>
+        <w:t xml:space="preserve"> has not prepared for classes on the subject; </w:t>
+      </w:r>
+      <w:r>
+        <w:br/>
+      </w:r>
       <w:r>
         <w:rPr>
           <w:rFonts w:ascii="Symbol" w:hAnsi="Symbol" w:eastAsia="Symbol"/>
@@ -14188,6 +14217,7 @@
           <w:color w:val="000000"/>
           <w:sz w:val="28"/>
         </w:rPr>
+        <w:t></w:t>
       </w:r>
       <w:r>
         <w:rPr>
@@ -14197,8 +14227,11 @@
           <w:color w:val="000000"/>
           <w:sz w:val="28"/>
         </w:rPr>
-      </w:r>
-      <w:r/>
+        <w:t xml:space="preserve"> has no understanding whatsoever of the classes on the subject; </w:t>
+      </w:r>
+      <w:r>
+        <w:br/>
+      </w:r>
       <w:r>
         <w:rPr>
           <w:rFonts w:ascii="Symbol" w:hAnsi="Symbol" w:eastAsia="Symbol"/>
@@ -14207,6 +14240,7 @@
           <w:color w:val="000000"/>
           <w:sz w:val="28"/>
         </w:rPr>
+        <w:t></w:t>
       </w:r>
       <w:r>
         <w:rPr>
@@ -14216,8 +14250,11 @@
           <w:color w:val="000000"/>
           <w:sz w:val="28"/>
         </w:rPr>
-      </w:r>
-      <w:r/>
+        <w:t xml:space="preserve"> has not fully completed independent assignments on the subject; </w:t>
+      </w:r>
+      <w:r>
+        <w:br/>
+      </w:r>
       <w:r>
         <w:rPr>
           <w:rFonts w:ascii="Symbol" w:hAnsi="Symbol" w:eastAsia="Symbol"/>
@@ -14226,6 +14263,7 @@
           <w:color w:val="000000"/>
           <w:sz w:val="28"/>
         </w:rPr>
+        <w:t></w:t>
       </w:r>
       <w:r>
         <w:rPr>
@@ -14235,6 +14273,7 @@
           <w:color w:val="000000"/>
           <w:sz w:val="28"/>
         </w:rPr>
+        <w:t xml:space="preserve"> it is evident that texts on the subject have been copied from others; </w:t>
       </w:r>
       <w:r>
         <w:rPr>
@@ -14244,6 +14283,7 @@
           <w:color w:val="000000"/>
           <w:sz w:val="28"/>
         </w:rPr>
+        <w:t></w:t>
       </w:r>
       <w:r>
         <w:rPr>
@@ -14253,6 +14293,7 @@
           <w:color w:val="000000"/>
           <w:sz w:val="28"/>
         </w:rPr>
+        <w:t xml:space="preserve"> serious errors and confusion have been allowed in the text on the subject; </w:t>
       </w:r>
       <w:r>
         <w:rPr>
@@ -14262,6 +14303,7 @@
           <w:color w:val="000000"/>
           <w:sz w:val="28"/>
         </w:rPr>
+        <w:t></w:t>
       </w:r>
       <w:r>
         <w:rPr>
@@ -14271,8 +14313,11 @@
           <w:color w:val="000000"/>
           <w:sz w:val="28"/>
         </w:rPr>
-      </w:r>
-      <w:r/>
+        <w:t xml:space="preserve"> no answer is obtained to the questions asked on the subject; </w:t>
+      </w:r>
+      <w:r>
+        <w:br/>
+      </w:r>
       <w:r>
         <w:rPr>
           <w:rFonts w:ascii="Symbol" w:hAnsi="Symbol" w:eastAsia="Symbol"/>
@@ -14281,6 +14326,7 @@
           <w:color w:val="000000"/>
           <w:sz w:val="28"/>
         </w:rPr>
+        <w:t></w:t>
       </w:r>
       <w:r>
         <w:rPr>
@@ -14290,6 +14336,7 @@
           <w:color w:val="000000"/>
           <w:sz w:val="28"/>
         </w:rPr>
+        <w:t xml:space="preserve"> does not know the subject. </w:t>
       </w:r>
     </w:p>
     <w:p>
@@ -14541,7 +14588,7 @@
                 <w:color w:val="000000"/>
                 <w:sz w:val="28"/>
               </w:rPr>
-              <w:t xml:space="preserve">Nigmatov A.N. Theoretical Foundations  Ecology. Textbook. – Tashkent, National Society  Philosophers  Uzbekistan Publishing House, 2013. — 268 p. </w:t>
+              <w:t xml:space="preserve">Nigmatov A.N. Theoretical Foundations of Ecology. </w:t>
             </w:r>
             <w:r>
               <w:rPr>
@@ -14551,6 +14598,7 @@
                 <w:color w:val="000000"/>
                 <w:sz w:val="28"/>
               </w:rPr>
+              <w:t xml:space="preserve">Textbook. – Tashkent, National Society of Philosophers </w:t>
             </w:r>
             <w:r>
               <w:rPr>
@@ -14560,6 +14608,7 @@
                 <w:color w:val="000000"/>
                 <w:sz w:val="28"/>
               </w:rPr>
+              <w:t xml:space="preserve">of Uzbekistan Publishing House, 2013. — 268 p. </w:t>
             </w:r>
           </w:p>
         </w:tc>
@@ -15191,7 +15240,7 @@
                 <w:color w:val="000000"/>
                 <w:sz w:val="28"/>
               </w:rPr>
-              <w:t xml:space="preserve">Tim Low. Climate Change &amp; Invasive Species. A Review  Interactions — November 2006 Workshop Report. </w:t>
+              <w:t xml:space="preserve">Tim Low. Climate Change &amp; Invasive Species. A </w:t>
             </w:r>
             <w:r>
               <w:rPr>
@@ -15201,6 +15250,7 @@
                 <w:color w:val="000000"/>
                 <w:sz w:val="28"/>
               </w:rPr>
+              <w:t xml:space="preserve">Review of Interactions — November 2006 Workshop </w:t>
             </w:r>
             <w:r>
               <w:rPr>
@@ -15210,6 +15260,7 @@
                 <w:color w:val="000000"/>
                 <w:sz w:val="28"/>
               </w:rPr>
+              <w:t xml:space="preserve">Report. </w:t>
             </w:r>
           </w:p>
           <w:p>
@@ -15796,9 +15847,7 @@
           <w:color w:val="000000"/>
           <w:sz w:val="28"/>
         </w:rPr>
-        <w:t xml:space="preserve">O'ZBEKISTON RESPUBLIKASI </w:t>
-        <w:br/>
-        <w:t>MINISTRY OF HIGHER EDUCATION, SCIENCE AND INNOVATION</w:t>
+        <w:t>O'ZBEKISTON RESPUBLIKASI</w:t>
       </w:r>
       <w:r/>
       <w:r>
@@ -15865,12 +15914,7 @@
         <w:jc w:val="left"/>
       </w:pPr>
       <w:r>
-        <w:tab/>
-        <w:t xml:space="preserve">Fakultet dekani ______________ fakulteti </w:t>
-        <w:br/>
-        <w:t xml:space="preserve">______________________  ______________________ (F.I.Sh.) </w:t>
-        <w:tab/>
-        <w:t xml:space="preserve">“___” __________________ 2026 </w:t>
+        <w:t>dekani</w:t>
       </w:r>
       <w:r>
         <w:rPr>
@@ -15919,11 +15963,7 @@
           <w:color w:val="000000"/>
           <w:sz w:val="28"/>
         </w:rPr>
-        <w:t xml:space="preserve">[Fan nomi] </w:t>
-        <w:br/>
-        <w:t xml:space="preserve">O'QUV DASTURI FOR THE SUBJECT </w:t>
-        <w:br/>
-        <w:t xml:space="preserve">(______________ ta'lim shakli) </w:t>
+        <w:t>[Fan nomi]</w:t>
       </w:r>
       <w:r/>
       <w:r>
@@ -15963,7 +16003,7 @@
           <w:color w:val="000000"/>
           <w:sz w:val="28"/>
         </w:rPr>
-        <w:t xml:space="preserve">Bilim soi: code – name </w:t>
+        <w:t>Bilim sohasi: kod – nomi</w:t>
       </w:r>
     </w:p>
     <w:p>
@@ -15983,7 +16023,7 @@
           <w:color w:val="000000"/>
           <w:sz w:val="28"/>
         </w:rPr>
-        <w:t xml:space="preserve">Ta'lim soi: code – name </w:t>
+        <w:t>Ta'lim sohasi: kod – nomi</w:t>
       </w:r>
     </w:p>
     <w:p>
@@ -16003,7 +16043,7 @@
           <w:color w:val="000000"/>
           <w:sz w:val="28"/>
         </w:rPr>
-        <w:t xml:space="preserve">Ta'lim yo'nalishi: code – name </w:t>
+        <w:t>Ta'lim yo'nalishi: kod – nomi</w:t>
       </w:r>
     </w:p>
     <w:p>
@@ -16023,7 +16063,7 @@
           <w:color w:val="000000"/>
           <w:sz w:val="28"/>
         </w:rPr>
-        <w:t>Tashkent – 2026</w:t>
+        <w:t>Toshkent – 2026</w:t>
       </w:r>
     </w:p>
     <w:p>
@@ -16065,7 +16105,7 @@
           <w:color w:val="000000"/>
           <w:sz w:val="28"/>
         </w:rPr>
-        <w:t xml:space="preserve">Ushbu o'quv dasturi ______________ fakulteti dated __ __________ 20__. </w:t>
+        <w:t>Ushbu o'quv dasturi ______________ fakulteti kengashi yig'ilishining 20__-yil __ __________ dagi __-son bayonnomasi bilan tasdiqlangan.</w:t>
       </w:r>
       <w:r>
         <w:rPr>
@@ -16125,7 +16165,7 @@
                 <w:color w:val="000000"/>
                 <w:sz w:val="28"/>
               </w:rPr>
-              <w:t xml:space="preserve">Ushbu </w:t>
+              <w:t>Ushbu</w:t>
             </w:r>
           </w:p>
         </w:tc>
@@ -16155,7 +16195,7 @@
                 <w:color w:val="000000"/>
                 <w:sz w:val="28"/>
               </w:rPr>
-              <w:t xml:space="preserve">o'quv dasturi </w:t>
+              <w:t xml:space="preserve">curriculum </w:t>
             </w:r>
           </w:p>
         </w:tc>
@@ -16185,7 +16225,7 @@
                 <w:color w:val="000000"/>
                 <w:sz w:val="28"/>
               </w:rPr>
-              <w:t xml:space="preserve"> </w:t>
+              <w:t xml:space="preserve">has </w:t>
             </w:r>
           </w:p>
         </w:tc>
@@ -16215,7 +16255,7 @@
                 <w:color w:val="000000"/>
                 <w:sz w:val="28"/>
               </w:rPr>
-              <w:t xml:space="preserve"> </w:t>
+              <w:t xml:space="preserve">been </w:t>
             </w:r>
           </w:p>
         </w:tc>
@@ -16245,7 +16285,7 @@
                 <w:color w:val="000000"/>
                 <w:sz w:val="28"/>
               </w:rPr>
-              <w:t xml:space="preserve">taqdim etilgan </w:t>
+              <w:t xml:space="preserve">presented </w:t>
             </w:r>
           </w:p>
         </w:tc>
@@ -16275,7 +16315,7 @@
                 <w:color w:val="000000"/>
                 <w:sz w:val="28"/>
               </w:rPr>
-              <w:t xml:space="preserve">tomonidan </w:t>
+              <w:t xml:space="preserve">by </w:t>
             </w:r>
           </w:p>
         </w:tc>
@@ -16305,7 +16345,7 @@
                 <w:color w:val="000000"/>
                 <w:sz w:val="28"/>
               </w:rPr>
-              <w:t xml:space="preserve"> </w:t>
+              <w:t xml:space="preserve">the </w:t>
             </w:r>
           </w:p>
         </w:tc>
@@ -16335,7 +16375,7 @@
                 <w:color w:val="000000"/>
                 <w:sz w:val="28"/>
               </w:rPr>
-              <w:t xml:space="preserve">kafedra </w:t>
+              <w:t xml:space="preserve">Department </w:t>
             </w:r>
           </w:p>
         </w:tc>
@@ -16365,7 +16405,7 @@
                 <w:color w:val="000000"/>
                 <w:sz w:val="28"/>
               </w:rPr>
-              <w:t xml:space="preserve"> </w:t>
+              <w:t xml:space="preserve">of </w:t>
             </w:r>
           </w:p>
         </w:tc>
@@ -16388,7 +16428,7 @@
           <w:color w:val="000000"/>
           <w:sz w:val="28"/>
         </w:rPr>
-        <w:t xml:space="preserve">“______________”  ______________ (Minutes No. __   department meeting dated __ __________ 20__). </w:t>
+        <w:t xml:space="preserve">“______________” of ______________ (Minutes No. __ of the department </w:t>
       </w:r>
       <w:r>
         <w:rPr>
@@ -16398,6 +16438,7 @@
           <w:color w:val="000000"/>
           <w:sz w:val="28"/>
         </w:rPr>
+        <w:t xml:space="preserve">meeting dated __ __________ 20__). </w:t>
       </w:r>
     </w:p>
     <w:p>
@@ -16440,7 +16481,7 @@
           <w:color w:val="000000"/>
           <w:sz w:val="28"/>
         </w:rPr>
-        <w:t xml:space="preserve">______________ – ______________.  F.I.Sh. – ilmiy daraja, unvon, kafedra nomi, lavozim. </w:t>
+        <w:t xml:space="preserve">______________ – ______________.  Full Name – academic degree, </w:t>
       </w:r>
       <w:r>
         <w:rPr>
@@ -16450,6 +16491,7 @@
           <w:color w:val="000000"/>
           <w:sz w:val="28"/>
         </w:rPr>
+        <w:t xml:space="preserve">title, name of department, position. </w:t>
       </w:r>
     </w:p>
     <w:p>
@@ -16472,7 +16514,7 @@
           <w:color w:val="000000"/>
           <w:sz w:val="28"/>
         </w:rPr>
-        <w:t xml:space="preserve">______________ – ______________.  F.I.Sh. – ilmiy daraja, unvon, kafedra nomi, lavozim. </w:t>
+        <w:t xml:space="preserve">______________ – ______________.  Full Name – academic degree, </w:t>
       </w:r>
       <w:r>
         <w:rPr>
@@ -16482,6 +16524,7 @@
           <w:color w:val="000000"/>
           <w:sz w:val="28"/>
         </w:rPr>
+        <w:t xml:space="preserve">title, name of department, position. </w:t>
       </w:r>
     </w:p>
     <w:p>
@@ -16524,7 +16567,7 @@
           <w:color w:val="000000"/>
           <w:sz w:val="28"/>
         </w:rPr>
-        <w:t xml:space="preserve">______________ – ______________.  F.I.Sh. – ilmiy daraja, unvon, kafedra nomi, lavozim. </w:t>
+        <w:t xml:space="preserve">______________ – ______________.  Full Name – academic degree, </w:t>
       </w:r>
       <w:r>
         <w:rPr>
@@ -16534,6 +16577,7 @@
           <w:color w:val="000000"/>
           <w:sz w:val="28"/>
         </w:rPr>
+        <w:t xml:space="preserve">title, name of department, position. </w:t>
       </w:r>
     </w:p>
     <w:p>
@@ -17593,7 +17637,7 @@
                 <w:color w:val="000000"/>
                 <w:sz w:val="28"/>
               </w:rPr>
-              <w:t>Auditoriya mashg'ulotlari, jami – … soat, shundan:</w:t>
+              <w:t>Auditoriya mashg'ulotlari, jami</w:t>
             </w:r>
             <w:r>
               <w:rPr>
@@ -17646,7 +17690,7 @@
                 <w:color w:val="000000"/>
                 <w:sz w:val="28"/>
               </w:rPr>
-              <w:t xml:space="preserve">Ma'ruza – …; Amaliy – …; Laboratoriya – … </w:t>
+              <w:t>Ma'ruza – …; Amaliy – …; Laboratoriya – …</w:t>
             </w:r>
           </w:p>
         </w:tc>
@@ -17924,9 +17968,7 @@
           <w:color w:val="000000"/>
           <w:sz w:val="28"/>
         </w:rPr>
-        <w:t xml:space="preserve">Fanning maqsadi – … </w:t>
-        <w:br/>
-        <w:t xml:space="preserve">Fanning vazifalari – … </w:t>
+        <w:t>Fanning maqsadi – ...</w:t>
       </w:r>
       <w:r/>
       <w:r>
@@ -19308,7 +19350,7 @@
           <w:color w:val="000000"/>
           <w:sz w:val="28"/>
         </w:rPr>
-        <w:t>Ma'ruza (M) — … soat</w:t>
+        <w:t>Ma'ruza (M)</w:t>
       </w:r>
     </w:p>
     <w:tbl>
@@ -19912,7 +19954,7 @@
           <w:color w:val="000000"/>
           <w:sz w:val="28"/>
         </w:rPr>
-        <w:t>Amaliy mashg'ulotlar (A) — … soat</w:t>
+        <w:t>Amaliy mashg'ulotlar (A)</w:t>
       </w:r>
     </w:p>
     <w:tbl>
@@ -20516,7 +20558,7 @@
           <w:color w:val="000000"/>
           <w:sz w:val="28"/>
         </w:rPr>
-        <w:t>Laboratoriya mashg'ulotlari (Lab) — … soat</w:t>
+        <w:t>Laboratoriya mashg'ulotlari (Lab)</w:t>
       </w:r>
     </w:p>
     <w:tbl>
@@ -21204,7 +21246,7 @@
                 <w:color w:val="000000"/>
                 <w:sz w:val="28"/>
               </w:rPr>
-              <w:t>6. Mustaqil ta'lim topshiriqlari — … soat</w:t>
+              <w:t>6. Mustaqil ta'lim topshiriqlari</w:t>
             </w:r>
           </w:p>
         </w:tc>
@@ -22144,21 +22186,7 @@
           <w:color w:val="000000"/>
           <w:sz w:val="28"/>
         </w:rPr>
-        <w:t>a) To receive a grade  5 (excellent), a student’s level  knowledge must meet  following:</w:t>
-        <w:br/>
-        <w:t xml:space="preserve">… </w:t>
-        <w:br/>
-        <w:t>b) To receive a grade  4 (good), a student’s level  knowledge must meet  following:</w:t>
-        <w:br/>
-        <w:t xml:space="preserve">… </w:t>
-        <w:br/>
-        <w:t>c) To receive a grade  3 (satisfactory), a student’s level  knowledge must meet  following:</w:t>
-        <w:br/>
-        <w:t xml:space="preserve">… </w:t>
-        <w:br/>
-        <w:t>d) In  following cases, a student’s level  knowledge may be assessed as unsatisfactory with a grade  2:</w:t>
-        <w:br/>
-        <w:t xml:space="preserve">… </w:t>
+        <w:t>a) 5 (a'lo) baho olish uchun talabaning bilim darajasi quyidagilarga javob berishi kerak:</w:t>
       </w:r>
       <w:r>
         <w:rPr>

</xml_diff>

<commit_message>
Translate Annex 21 Module Handbook (Computer Systems) to Uzbek DOCX
- Annex 21: Module Handbook Computer Systems and Their Softwares Master (244 pages) - new
- Annex 4: minor update

Co-Authored-By: Claude Opus 4.6 <noreply@anthropic.com>
Claude-Session: https://claude.ai/code/session_01N9ZP28hxEfPoWHf2qaE8QM
</commit_message>
<xml_diff>
--- a/Computer Engineering, Software Engineering, Computer systems & their softwares/Annexes/Annex №4 Curriculum Development Guidelines.docx
+++ b/Computer Engineering, Software Engineering, Computer systems & their softwares/Annexes/Annex №4 Curriculum Development Guidelines.docx
@@ -2043,7 +2043,7 @@
           <w:color w:val="000000"/>
           <w:sz w:val="28"/>
         </w:rPr>
-        <w:t xml:space="preserve">the second page of the curriculum shall indicate the compilers’ surname, </w:t>
+        <w:t>o'quv dasturining ikkinchi sahifasida tuzuvchilarning familiyasi, ismi, otasining ismi, ilmiy darajasi va unvoni, ish joyi va lavozimi; tegishli sohadagi taqrizchi(lar)ning familiyasi, ismi, ish joyi, lavozimi, ilmiy darajasi va unvoni; o'quv dasturini tasdiqlagan fakultet kengashi (ilmiy kengashi) haqida ma'lumot, qaror bayonnomasi raqami va sanasi ko'rsatiladi;</w:t>
       </w:r>
       <w:r>
         <w:rPr>
@@ -2053,7 +2053,6 @@
           <w:color w:val="000000"/>
           <w:sz w:val="28"/>
         </w:rPr>
-        <w:t xml:space="preserve">first name, patronymic, academic degree and title, place of work and position; </w:t>
       </w:r>
       <w:r>
         <w:rPr>
@@ -2063,7 +2062,6 @@
           <w:color w:val="000000"/>
           <w:sz w:val="28"/>
         </w:rPr>
-        <w:t xml:space="preserve">the surname, first name, place of work, position, academic degree and title of </w:t>
       </w:r>
       <w:r>
         <w:rPr>
@@ -2073,7 +2071,6 @@
           <w:color w:val="000000"/>
           <w:sz w:val="28"/>
         </w:rPr>
-        <w:t xml:space="preserve">the reviewers who gave their opinion on the curriculum; as well as the number </w:t>
       </w:r>
       <w:r>
         <w:rPr>
@@ -2083,7 +2080,6 @@
           <w:color w:val="000000"/>
           <w:sz w:val="28"/>
         </w:rPr>
-        <w:t xml:space="preserve">and date of the minutes of the Faculty and Department Council meetings at </w:t>
       </w:r>
       <w:r>
         <w:rPr>
@@ -2093,7 +2089,6 @@
           <w:color w:val="000000"/>
           <w:sz w:val="28"/>
         </w:rPr>
-        <w:t xml:space="preserve">which the curriculum was considered. </w:t>
       </w:r>
     </w:p>
     <w:p>
@@ -3720,7 +3715,7 @@
           <w:color w:val="000000"/>
           <w:sz w:val="28"/>
         </w:rPr>
-        <w:t>“APPROVED”</w:t>
+        <w:t>"TASDIQLANGAN"</w:t>
       </w:r>
     </w:p>
     <w:p>
@@ -3760,7 +3755,7 @@
           <w:color w:val="000000"/>
           <w:sz w:val="28"/>
         </w:rPr>
-        <w:t xml:space="preserve">______________________ F. Rakhmatullayev </w:t>
+        <w:t>______________________ F. Raxmatullayev</w:t>
       </w:r>
     </w:p>
     <w:p>
@@ -3780,7 +3775,7 @@
           <w:color w:val="000000"/>
           <w:sz w:val="28"/>
         </w:rPr>
-        <w:t xml:space="preserve">“28” August 2026 </w:t>
+        <w:t>"28" Avgust 2026</w:t>
       </w:r>
     </w:p>
     <w:p>
@@ -5852,7 +5847,7 @@
                 <w:color w:val="000000"/>
                 <w:sz w:val="28"/>
               </w:rPr>
-              <w:t xml:space="preserve">(K1106) Chemistry </w:t>
+              <w:t>(K1106) Kimyo</w:t>
             </w:r>
           </w:p>
         </w:tc>
@@ -5938,7 +5933,7 @@
                 <w:color w:val="000000"/>
                 <w:sz w:val="28"/>
               </w:rPr>
-              <w:t xml:space="preserve">(F1206) Physics </w:t>
+              <w:t>(F1206) Fizika</w:t>
             </w:r>
           </w:p>
         </w:tc>
@@ -13094,7 +13089,19 @@
           <w:color w:val="000000"/>
           <w:sz w:val="28"/>
         </w:rPr>
-        <w:t></w:t>
+        <w:t xml:space="preserve"> ma'ruzalar;</w:t>
+        <w:br/>
+        <w:t xml:space="preserve"> amaliy va laboratoriya ishlarini bajarish va xulosalar chiqarish;</w:t>
+        <w:br/>
+        <w:t xml:space="preserve"> interaktiv keys-stadlar;</w:t>
+        <w:br/>
+        <w:t xml:space="preserve"> tezkor (blits) so'rovlar;</w:t>
+        <w:br/>
+        <w:t xml:space="preserve"> guruh ishi;</w:t>
+        <w:br/>
+        <w:t xml:space="preserve"> taqdimotlar berish;</w:t>
+        <w:br/>
+        <w:t xml:space="preserve"> mustaqil fikrlash uchun loyihalar.</w:t>
       </w:r>
       <w:r>
         <w:rPr>
@@ -13104,11 +13111,8 @@
           <w:color w:val="000000"/>
           <w:sz w:val="28"/>
         </w:rPr>
-        <w:t xml:space="preserve"> lectures; </w:t>
-      </w:r>
-      <w:r>
-        <w:br/>
-      </w:r>
+      </w:r>
+      <w:r/>
       <w:r>
         <w:rPr>
           <w:rFonts w:ascii="Symbol" w:hAnsi="Symbol" w:eastAsia="Symbol"/>
@@ -13117,7 +13121,6 @@
           <w:color w:val="000000"/>
           <w:sz w:val="28"/>
         </w:rPr>
-        <w:t></w:t>
       </w:r>
       <w:r>
         <w:rPr>
@@ -13127,7 +13130,6 @@
           <w:color w:val="000000"/>
           <w:sz w:val="28"/>
         </w:rPr>
-        <w:t xml:space="preserve"> performing and drawing conclusions from practical and laboratory work; </w:t>
       </w:r>
       <w:r>
         <w:rPr>
@@ -13137,7 +13139,6 @@
           <w:color w:val="000000"/>
           <w:sz w:val="28"/>
         </w:rPr>
-        <w:t></w:t>
       </w:r>
       <w:r>
         <w:rPr>
@@ -13147,11 +13148,8 @@
           <w:color w:val="000000"/>
           <w:sz w:val="28"/>
         </w:rPr>
-        <w:t xml:space="preserve"> interactive case studies; </w:t>
-      </w:r>
-      <w:r>
-        <w:br/>
-      </w:r>
+      </w:r>
+      <w:r/>
       <w:r>
         <w:rPr>
           <w:rFonts w:ascii="Symbol" w:hAnsi="Symbol" w:eastAsia="Symbol"/>
@@ -13160,7 +13158,6 @@
           <w:color w:val="000000"/>
           <w:sz w:val="28"/>
         </w:rPr>
-        <w:t></w:t>
       </w:r>
       <w:r>
         <w:rPr>
@@ -13170,11 +13167,8 @@
           <w:color w:val="000000"/>
           <w:sz w:val="28"/>
         </w:rPr>
-        <w:t xml:space="preserve"> rapid-fire (blitz) surveys; </w:t>
-      </w:r>
-      <w:r>
-        <w:br/>
-      </w:r>
+      </w:r>
+      <w:r/>
       <w:r>
         <w:rPr>
           <w:rFonts w:ascii="Symbol" w:hAnsi="Symbol" w:eastAsia="Symbol"/>
@@ -13183,7 +13177,6 @@
           <w:color w:val="000000"/>
           <w:sz w:val="28"/>
         </w:rPr>
-        <w:t></w:t>
       </w:r>
       <w:r>
         <w:rPr>
@@ -13193,11 +13186,8 @@
           <w:color w:val="000000"/>
           <w:sz w:val="28"/>
         </w:rPr>
-        <w:t xml:space="preserve"> group work; </w:t>
-      </w:r>
-      <w:r>
-        <w:br/>
-      </w:r>
+      </w:r>
+      <w:r/>
       <w:r>
         <w:rPr>
           <w:rFonts w:ascii="Symbol" w:hAnsi="Symbol" w:eastAsia="Symbol"/>
@@ -13206,7 +13196,6 @@
           <w:color w:val="000000"/>
           <w:sz w:val="28"/>
         </w:rPr>
-        <w:t></w:t>
       </w:r>
       <w:r>
         <w:rPr>
@@ -13216,11 +13205,8 @@
           <w:color w:val="000000"/>
           <w:sz w:val="28"/>
         </w:rPr>
-        <w:t xml:space="preserve"> giving presentations; </w:t>
-      </w:r>
-      <w:r>
-        <w:br/>
-      </w:r>
+      </w:r>
+      <w:r/>
       <w:r>
         <w:rPr>
           <w:rFonts w:ascii="Symbol" w:hAnsi="Symbol" w:eastAsia="Symbol"/>
@@ -13229,7 +13215,6 @@
           <w:color w:val="000000"/>
           <w:sz w:val="28"/>
         </w:rPr>
-        <w:t></w:t>
       </w:r>
       <w:r>
         <w:rPr>
@@ -13239,7 +13224,6 @@
           <w:color w:val="000000"/>
           <w:sz w:val="28"/>
         </w:rPr>
-        <w:t xml:space="preserve"> projects for teamwork and defense. </w:t>
       </w:r>
     </w:p>
     <w:tbl>
@@ -13470,7 +13454,18 @@
           <w:color w:val="000000"/>
           <w:sz w:val="28"/>
         </w:rPr>
-        <w:t></w:t>
+        <w:t xml:space="preserve"> fan mohiyati va mazmunini to'liq ochib beradi;</w:t>
+        <w:br/>
+        <w:t xml:space="preserve"> fan mavzularini ilmiy qat'iylik va mantiqni saqlagan holda bayon etadi,</w:t>
+        <w:br/>
+        <w:tab/>
+        <w:t>ilmiy xatoliklarga yoki chalkashliklarga yo'l qo'ymaydi;</w:t>
+        <w:br/>
+        <w:t xml:space="preserve"> fan amaliy ahamiyatini har tomonlama tushunadi;</w:t>
+        <w:br/>
+        <w:t xml:space="preserve"> fan bo'yicha mustaqil topshiriqlarni to'liq bajargan;</w:t>
+        <w:br/>
+        <w:t xml:space="preserve"> fanda olingan bilimlarni amaliy faoliyatda erkin qo'llashga qodir.</w:t>
       </w:r>
       <w:r>
         <w:rPr>
@@ -13480,11 +13475,8 @@
           <w:color w:val="000000"/>
           <w:sz w:val="28"/>
         </w:rPr>
-        <w:t xml:space="preserve"> fully reveals the essence and content of the subject; </w:t>
-      </w:r>
-      <w:r>
-        <w:br/>
-      </w:r>
+      </w:r>
+      <w:r/>
       <w:r>
         <w:rPr>
           <w:rFonts w:ascii="Symbol" w:hAnsi="Symbol" w:eastAsia="Symbol"/>
@@ -13493,7 +13485,6 @@
           <w:color w:val="000000"/>
           <w:sz w:val="28"/>
         </w:rPr>
-        <w:t></w:t>
       </w:r>
       <w:r>
         <w:rPr>
@@ -13503,11 +13494,8 @@
           <w:color w:val="000000"/>
           <w:sz w:val="28"/>
         </w:rPr>
-        <w:t xml:space="preserve"> presents the topics of the subject while maintaining scientific rigor and logic, </w:t>
-      </w:r>
-      <w:r>
-        <w:tab/>
-      </w:r>
+      </w:r>
+      <w:r/>
       <w:r>
         <w:rPr>
           <w:rFonts w:ascii="Arial" w:hAnsi="Arial" w:eastAsia="Arial"/>
@@ -13516,11 +13504,8 @@
           <w:color w:val="000000"/>
           <w:sz w:val="28"/>
         </w:rPr>
-        <w:t xml:space="preserve">without allowing scientific errors or confusion; </w:t>
-      </w:r>
-      <w:r>
-        <w:br/>
-      </w:r>
+      </w:r>
+      <w:r/>
       <w:r>
         <w:rPr>
           <w:rFonts w:ascii="Symbol" w:hAnsi="Symbol" w:eastAsia="Symbol"/>
@@ -13529,7 +13514,6 @@
           <w:color w:val="000000"/>
           <w:sz w:val="28"/>
         </w:rPr>
-        <w:t></w:t>
       </w:r>
       <w:r>
         <w:rPr>
@@ -13539,11 +13523,8 @@
           <w:color w:val="000000"/>
           <w:sz w:val="28"/>
         </w:rPr>
-        <w:t xml:space="preserve"> has a clear understanding of the theoretical or practical significance of the </w:t>
-      </w:r>
-      <w:r>
-        <w:tab/>
-      </w:r>
+      </w:r>
+      <w:r/>
       <w:r>
         <w:rPr>
           <w:rFonts w:ascii="Arial" w:hAnsi="Arial" w:eastAsia="Arial"/>
@@ -13552,11 +13533,8 @@
           <w:color w:val="000000"/>
           <w:sz w:val="28"/>
         </w:rPr>
-        <w:t xml:space="preserve">subject’s topic materials; </w:t>
-      </w:r>
-      <w:r>
-        <w:br/>
-      </w:r>
+      </w:r>
+      <w:r/>
       <w:r>
         <w:rPr>
           <w:rFonts w:ascii="Symbol" w:hAnsi="Symbol" w:eastAsia="Symbol"/>
@@ -13565,7 +13543,6 @@
           <w:color w:val="000000"/>
           <w:sz w:val="28"/>
         </w:rPr>
-        <w:t></w:t>
       </w:r>
       <w:r>
         <w:rPr>
@@ -13575,7 +13552,6 @@
           <w:color w:val="000000"/>
           <w:sz w:val="28"/>
         </w:rPr>
-        <w:t xml:space="preserve"> demonstrates the ability to think freely and independently within the subject; </w:t>
       </w:r>
       <w:r>
         <w:rPr>
@@ -13585,7 +13561,6 @@
           <w:color w:val="000000"/>
           <w:sz w:val="28"/>
         </w:rPr>
-        <w:t></w:t>
       </w:r>
       <w:r>
         <w:rPr>
@@ -13595,11 +13570,8 @@
           <w:color w:val="000000"/>
           <w:sz w:val="28"/>
         </w:rPr>
-        <w:t xml:space="preserve"> gives clear and concise answers to the questions asked; </w:t>
-      </w:r>
-      <w:r>
-        <w:br/>
-      </w:r>
+      </w:r>
+      <w:r/>
       <w:r>
         <w:rPr>
           <w:rFonts w:ascii="Symbol" w:hAnsi="Symbol" w:eastAsia="Symbol"/>
@@ -13608,7 +13580,6 @@
           <w:color w:val="000000"/>
           <w:sz w:val="28"/>
         </w:rPr>
-        <w:t></w:t>
       </w:r>
       <w:r>
         <w:rPr>
@@ -13618,11 +13589,8 @@
           <w:color w:val="000000"/>
           <w:sz w:val="28"/>
         </w:rPr>
-        <w:t xml:space="preserve"> is thoroughly prepared with lecture notes; </w:t>
-      </w:r>
-      <w:r>
-        <w:br/>
-      </w:r>
+      </w:r>
+      <w:r/>
       <w:r>
         <w:rPr>
           <w:rFonts w:ascii="Symbol" w:hAnsi="Symbol" w:eastAsia="Symbol"/>
@@ -13631,7 +13599,6 @@
           <w:color w:val="000000"/>
           <w:sz w:val="28"/>
         </w:rPr>
-        <w:t></w:t>
       </w:r>
       <w:r>
         <w:rPr>
@@ -13641,11 +13608,8 @@
           <w:color w:val="000000"/>
           <w:sz w:val="28"/>
         </w:rPr>
-        <w:t xml:space="preserve"> has completed independent assignments fully and accurately; </w:t>
-      </w:r>
-      <w:r>
-        <w:br/>
-      </w:r>
+      </w:r>
+      <w:r/>
       <w:r>
         <w:rPr>
           <w:rFonts w:ascii="Symbol" w:hAnsi="Symbol" w:eastAsia="Symbol"/>
@@ -13654,7 +13618,6 @@
           <w:color w:val="000000"/>
           <w:sz w:val="28"/>
         </w:rPr>
-        <w:t></w:t>
       </w:r>
       <w:r>
         <w:rPr>
@@ -13664,11 +13627,8 @@
           <w:color w:val="000000"/>
           <w:sz w:val="28"/>
         </w:rPr>
-        <w:t xml:space="preserve"> has mastered all practical skills and abilities; </w:t>
-      </w:r>
-      <w:r>
-        <w:br/>
-      </w:r>
+      </w:r>
+      <w:r/>
       <w:r>
         <w:rPr>
           <w:rFonts w:ascii="Symbol" w:hAnsi="Symbol" w:eastAsia="Symbol"/>
@@ -13677,7 +13637,6 @@
           <w:color w:val="000000"/>
           <w:sz w:val="28"/>
         </w:rPr>
-        <w:t></w:t>
       </w:r>
       <w:r>
         <w:rPr>
@@ -13687,11 +13646,8 @@
           <w:color w:val="000000"/>
           <w:sz w:val="28"/>
         </w:rPr>
-        <w:t xml:space="preserve"> is able to apply theoretical knowledge in various situations; </w:t>
-      </w:r>
-      <w:r>
-        <w:br/>
-      </w:r>
+      </w:r>
+      <w:r/>
       <w:r>
         <w:rPr>
           <w:rFonts w:ascii="Symbol" w:hAnsi="Symbol" w:eastAsia="Symbol"/>
@@ -13700,7 +13656,6 @@
           <w:color w:val="000000"/>
           <w:sz w:val="28"/>
         </w:rPr>
-        <w:t></w:t>
       </w:r>
       <w:r>
         <w:rPr>
@@ -13710,7 +13665,6 @@
           <w:color w:val="000000"/>
           <w:sz w:val="28"/>
         </w:rPr>
-        <w:t xml:space="preserve"> follows a systematic approach and maintains continuity. </w:t>
       </w:r>
     </w:p>
     <w:p>
@@ -13762,7 +13716,16 @@
           <w:color w:val="000000"/>
           <w:sz w:val="28"/>
         </w:rPr>
-        <w:t></w:t>
+        <w:t xml:space="preserve"> fan mohiyati va mazmunini tushunadi va</w:t>
+        <w:br/>
+        <w:tab/>
+        <w:t>mavzularni bayon etishda ilmiy yoki mantiqiy chalkashlikka yo'l qo'ymaydi;</w:t>
+        <w:br/>
+        <w:t xml:space="preserve"> fan mazmunining amaliy ahamiyatini tushunadi;</w:t>
+        <w:br/>
+        <w:t xml:space="preserve"> fan bo'yicha mustaqil topshiriqlarni to'liq bajargan;</w:t>
+        <w:br/>
+        <w:t xml:space="preserve"> fanda olingan bilimlarni amaliy faoliyatda to'g'ri qo'llaydi.</w:t>
       </w:r>
       <w:r>
         <w:rPr>
@@ -13772,11 +13735,8 @@
           <w:color w:val="000000"/>
           <w:sz w:val="28"/>
         </w:rPr>
-        <w:t xml:space="preserve"> understands the essence and content of the subject and does not allow </w:t>
-      </w:r>
-      <w:r>
-        <w:tab/>
-      </w:r>
+      </w:r>
+      <w:r/>
       <w:r>
         <w:rPr>
           <w:rFonts w:ascii="Arial" w:hAnsi="Arial" w:eastAsia="Arial"/>
@@ -13785,11 +13745,8 @@
           <w:color w:val="000000"/>
           <w:sz w:val="28"/>
         </w:rPr>
-        <w:t xml:space="preserve">scientific or logical confusion in presenting the topics; </w:t>
-      </w:r>
-      <w:r>
-        <w:br/>
-      </w:r>
+      </w:r>
+      <w:r/>
       <w:r>
         <w:rPr>
           <w:rFonts w:ascii="Symbol" w:hAnsi="Symbol" w:eastAsia="Symbol"/>
@@ -13798,7 +13755,6 @@
           <w:color w:val="000000"/>
           <w:sz w:val="28"/>
         </w:rPr>
-        <w:t></w:t>
       </w:r>
       <w:r>
         <w:rPr>
@@ -13808,11 +13764,8 @@
           <w:color w:val="000000"/>
           <w:sz w:val="28"/>
         </w:rPr>
-        <w:t xml:space="preserve"> understands the practical significance of the content of the subject; </w:t>
-      </w:r>
-      <w:r>
-        <w:br/>
-      </w:r>
+      </w:r>
+      <w:r/>
       <w:r>
         <w:rPr>
           <w:rFonts w:ascii="Symbol" w:hAnsi="Symbol" w:eastAsia="Symbol"/>
@@ -13821,7 +13774,6 @@
           <w:color w:val="000000"/>
           <w:sz w:val="28"/>
         </w:rPr>
-        <w:t></w:t>
       </w:r>
       <w:r>
         <w:rPr>
@@ -13831,11 +13783,8 @@
           <w:color w:val="000000"/>
           <w:sz w:val="28"/>
         </w:rPr>
-        <w:t xml:space="preserve"> completes the assigned tasks and assignments within the scope of the </w:t>
-      </w:r>
-      <w:r>
-        <w:tab/>
-      </w:r>
+      </w:r>
+      <w:r/>
       <w:r>
         <w:rPr>
           <w:rFonts w:ascii="Arial" w:hAnsi="Arial" w:eastAsia="Arial"/>
@@ -13844,11 +13793,8 @@
           <w:color w:val="000000"/>
           <w:sz w:val="28"/>
         </w:rPr>
-        <w:t xml:space="preserve">curriculum; </w:t>
-      </w:r>
-      <w:r>
-        <w:br/>
-      </w:r>
+      </w:r>
+      <w:r/>
       <w:r>
         <w:rPr>
           <w:rFonts w:ascii="Symbol" w:hAnsi="Symbol" w:eastAsia="Symbol"/>
@@ -13857,7 +13803,6 @@
           <w:color w:val="000000"/>
           <w:sz w:val="28"/>
         </w:rPr>
-        <w:t></w:t>
       </w:r>
       <w:r>
         <w:rPr>
@@ -13867,11 +13812,8 @@
           <w:color w:val="000000"/>
           <w:sz w:val="28"/>
         </w:rPr>
-        <w:t xml:space="preserve"> correctly answers the questions asked on the subject; </w:t>
-      </w:r>
-      <w:r>
-        <w:br/>
-      </w:r>
+      </w:r>
+      <w:r/>
       <w:r>
         <w:rPr>
           <w:rFonts w:ascii="Symbol" w:hAnsi="Symbol" w:eastAsia="Symbol"/>
@@ -13880,7 +13822,6 @@
           <w:color w:val="000000"/>
           <w:sz w:val="28"/>
         </w:rPr>
-        <w:t></w:t>
       </w:r>
       <w:r>
         <w:rPr>
@@ -13890,11 +13831,8 @@
           <w:color w:val="000000"/>
           <w:sz w:val="28"/>
         </w:rPr>
-        <w:t xml:space="preserve"> has thoroughly compiled lecture notes on the subject; </w:t>
-      </w:r>
-      <w:r>
-        <w:br/>
-      </w:r>
+      </w:r>
+      <w:r/>
       <w:r>
         <w:rPr>
           <w:rFonts w:ascii="Symbol" w:hAnsi="Symbol" w:eastAsia="Symbol"/>
@@ -13903,7 +13841,6 @@
           <w:color w:val="000000"/>
           <w:sz w:val="28"/>
         </w:rPr>
-        <w:t></w:t>
       </w:r>
       <w:r>
         <w:rPr>
@@ -13913,11 +13850,8 @@
           <w:color w:val="000000"/>
           <w:sz w:val="28"/>
         </w:rPr>
-        <w:t xml:space="preserve"> has fully completed the independent assignments on the subject; </w:t>
-      </w:r>
-      <w:r>
-        <w:br/>
-      </w:r>
+      </w:r>
+      <w:r/>
       <w:r>
         <w:rPr>
           <w:rFonts w:ascii="Symbol" w:hAnsi="Symbol" w:eastAsia="Symbol"/>
@@ -13926,7 +13860,6 @@
           <w:color w:val="000000"/>
           <w:sz w:val="28"/>
         </w:rPr>
-        <w:t></w:t>
       </w:r>
       <w:r>
         <w:rPr>
@@ -13936,7 +13869,6 @@
           <w:color w:val="000000"/>
           <w:sz w:val="28"/>
         </w:rPr>
-        <w:t xml:space="preserve"> has made an effort to master all practical skills and abilities. </w:t>
       </w:r>
     </w:p>
     <w:p>
@@ -13988,7 +13920,16 @@
           <w:color w:val="000000"/>
           <w:sz w:val="28"/>
         </w:rPr>
-        <w:t></w:t>
+        <w:t xml:space="preserve"> fan haqida umumiy tushunchaga ega;</w:t>
+        <w:br/>
+        <w:t xml:space="preserve"> fan mavzularini tor doirada bayon etadi, bayonida</w:t>
+        <w:br/>
+        <w:tab/>
+        <w:t>ba'zi chalkashliklarga yo'l qo'yadi;</w:t>
+        <w:br/>
+        <w:t xml:space="preserve"> fan bo'yicha mustaqil topshiriqlarni to'liq bajargan;</w:t>
+        <w:br/>
+        <w:t xml:space="preserve"> fanda olingan bilimlarni amaliy faoliyatda qiyinchilik bilan qo'llaydi.</w:t>
       </w:r>
       <w:r>
         <w:rPr>
@@ -13998,11 +13939,8 @@
           <w:color w:val="000000"/>
           <w:sz w:val="28"/>
         </w:rPr>
-        <w:t xml:space="preserve"> has a general understanding of the subject; </w:t>
-      </w:r>
-      <w:r>
-        <w:br/>
-      </w:r>
+      </w:r>
+      <w:r/>
       <w:r>
         <w:rPr>
           <w:rFonts w:ascii="Symbol" w:hAnsi="Symbol" w:eastAsia="Symbol"/>
@@ -14011,7 +13949,6 @@
           <w:color w:val="000000"/>
           <w:sz w:val="28"/>
         </w:rPr>
-        <w:t></w:t>
       </w:r>
       <w:r>
         <w:rPr>
@@ -14021,11 +13958,8 @@
           <w:color w:val="000000"/>
           <w:sz w:val="28"/>
         </w:rPr>
-        <w:t xml:space="preserve"> presents the topics of the subject in a narrow scope, allowing some </w:t>
-      </w:r>
-      <w:r>
-        <w:tab/>
-      </w:r>
+      </w:r>
+      <w:r/>
       <w:r>
         <w:rPr>
           <w:rFonts w:ascii="Arial" w:hAnsi="Arial" w:eastAsia="Arial"/>
@@ -14034,11 +13968,8 @@
           <w:color w:val="000000"/>
           <w:sz w:val="28"/>
         </w:rPr>
-        <w:t xml:space="preserve">confusion in the presentation; </w:t>
-      </w:r>
-      <w:r>
-        <w:br/>
-      </w:r>
+      </w:r>
+      <w:r/>
       <w:r>
         <w:rPr>
           <w:rFonts w:ascii="Symbol" w:hAnsi="Symbol" w:eastAsia="Symbol"/>
@@ -14047,7 +13978,6 @@
           <w:color w:val="000000"/>
           <w:sz w:val="28"/>
         </w:rPr>
-        <w:t></w:t>
       </w:r>
       <w:r>
         <w:rPr>
@@ -14057,11 +13987,8 @@
           <w:color w:val="000000"/>
           <w:sz w:val="28"/>
         </w:rPr>
-        <w:t xml:space="preserve"> has fully completed independent assignments on the subject; </w:t>
-      </w:r>
-      <w:r>
-        <w:br/>
-      </w:r>
+      </w:r>
+      <w:r/>
       <w:r>
         <w:rPr>
           <w:rFonts w:ascii="Symbol" w:hAnsi="Symbol" w:eastAsia="Symbol"/>
@@ -14070,7 +13997,6 @@
           <w:color w:val="000000"/>
           <w:sz w:val="28"/>
         </w:rPr>
-        <w:t></w:t>
       </w:r>
       <w:r>
         <w:rPr>
@@ -14080,11 +14006,8 @@
           <w:color w:val="000000"/>
           <w:sz w:val="28"/>
         </w:rPr>
-        <w:t xml:space="preserve"> the presentation is not fluent; </w:t>
-      </w:r>
-      <w:r>
-        <w:br/>
-      </w:r>
+      </w:r>
+      <w:r/>
       <w:r>
         <w:rPr>
           <w:rFonts w:ascii="Symbol" w:hAnsi="Symbol" w:eastAsia="Symbol"/>
@@ -14093,7 +14016,6 @@
           <w:color w:val="000000"/>
           <w:sz w:val="28"/>
         </w:rPr>
-        <w:t></w:t>
       </w:r>
       <w:r>
         <w:rPr>
@@ -14103,11 +14025,8 @@
           <w:color w:val="000000"/>
           <w:sz w:val="28"/>
         </w:rPr>
-        <w:t xml:space="preserve"> gives vague and confused answers to questions on the subject; </w:t>
-      </w:r>
-      <w:r>
-        <w:br/>
-      </w:r>
+      </w:r>
+      <w:r/>
       <w:r>
         <w:rPr>
           <w:rFonts w:ascii="Symbol" w:hAnsi="Symbol" w:eastAsia="Symbol"/>
@@ -14116,7 +14035,6 @@
           <w:color w:val="000000"/>
           <w:sz w:val="28"/>
         </w:rPr>
-        <w:t></w:t>
       </w:r>
       <w:r>
         <w:rPr>
@@ -14126,7 +14044,6 @@
           <w:color w:val="000000"/>
           <w:sz w:val="28"/>
         </w:rPr>
-        <w:t xml:space="preserve"> the text on the subject has not been thoroughly composed; </w:t>
       </w:r>
     </w:p>
     <w:p>
@@ -14194,7 +14111,13 @@
           <w:color w:val="000000"/>
           <w:sz w:val="28"/>
         </w:rPr>
-        <w:t></w:t>
+        <w:t xml:space="preserve"> fan bo'yicha mashg'ulotlarga tayyorlanmagan;</w:t>
+        <w:br/>
+        <w:t xml:space="preserve"> fan bo'yicha mashg'ulotlarni mutlaqo tushunmaydi;</w:t>
+        <w:br/>
+        <w:t xml:space="preserve"> fan bo'yicha mustaqil topshiriqlarni to'liq bajarmagan;</w:t>
+        <w:br/>
+        <w:t xml:space="preserve"> talaba fandagi asosiy yoki amaliy tushunchalarning birortasini ham o'zlashtirmaganligi aniq.</w:t>
       </w:r>
       <w:r>
         <w:rPr>
@@ -14204,11 +14127,8 @@
           <w:color w:val="000000"/>
           <w:sz w:val="28"/>
         </w:rPr>
-        <w:t xml:space="preserve"> has not prepared for classes on the subject; </w:t>
-      </w:r>
-      <w:r>
-        <w:br/>
-      </w:r>
+      </w:r>
+      <w:r/>
       <w:r>
         <w:rPr>
           <w:rFonts w:ascii="Symbol" w:hAnsi="Symbol" w:eastAsia="Symbol"/>
@@ -14217,7 +14137,6 @@
           <w:color w:val="000000"/>
           <w:sz w:val="28"/>
         </w:rPr>
-        <w:t></w:t>
       </w:r>
       <w:r>
         <w:rPr>
@@ -14227,11 +14146,8 @@
           <w:color w:val="000000"/>
           <w:sz w:val="28"/>
         </w:rPr>
-        <w:t xml:space="preserve"> has no understanding whatsoever of the classes on the subject; </w:t>
-      </w:r>
-      <w:r>
-        <w:br/>
-      </w:r>
+      </w:r>
+      <w:r/>
       <w:r>
         <w:rPr>
           <w:rFonts w:ascii="Symbol" w:hAnsi="Symbol" w:eastAsia="Symbol"/>
@@ -14240,7 +14156,6 @@
           <w:color w:val="000000"/>
           <w:sz w:val="28"/>
         </w:rPr>
-        <w:t></w:t>
       </w:r>
       <w:r>
         <w:rPr>
@@ -14250,11 +14165,8 @@
           <w:color w:val="000000"/>
           <w:sz w:val="28"/>
         </w:rPr>
-        <w:t xml:space="preserve"> has not fully completed independent assignments on the subject; </w:t>
-      </w:r>
-      <w:r>
-        <w:br/>
-      </w:r>
+      </w:r>
+      <w:r/>
       <w:r>
         <w:rPr>
           <w:rFonts w:ascii="Symbol" w:hAnsi="Symbol" w:eastAsia="Symbol"/>
@@ -14263,7 +14175,6 @@
           <w:color w:val="000000"/>
           <w:sz w:val="28"/>
         </w:rPr>
-        <w:t></w:t>
       </w:r>
       <w:r>
         <w:rPr>
@@ -14273,7 +14184,6 @@
           <w:color w:val="000000"/>
           <w:sz w:val="28"/>
         </w:rPr>
-        <w:t xml:space="preserve"> it is evident that texts on the subject have been copied from others; </w:t>
       </w:r>
       <w:r>
         <w:rPr>
@@ -14283,7 +14193,6 @@
           <w:color w:val="000000"/>
           <w:sz w:val="28"/>
         </w:rPr>
-        <w:t></w:t>
       </w:r>
       <w:r>
         <w:rPr>
@@ -14293,7 +14202,6 @@
           <w:color w:val="000000"/>
           <w:sz w:val="28"/>
         </w:rPr>
-        <w:t xml:space="preserve"> serious errors and confusion have been allowed in the text on the subject; </w:t>
       </w:r>
       <w:r>
         <w:rPr>
@@ -14303,7 +14211,6 @@
           <w:color w:val="000000"/>
           <w:sz w:val="28"/>
         </w:rPr>
-        <w:t></w:t>
       </w:r>
       <w:r>
         <w:rPr>
@@ -14313,11 +14220,8 @@
           <w:color w:val="000000"/>
           <w:sz w:val="28"/>
         </w:rPr>
-        <w:t xml:space="preserve"> no answer is obtained to the questions asked on the subject; </w:t>
-      </w:r>
-      <w:r>
-        <w:br/>
-      </w:r>
+      </w:r>
+      <w:r/>
       <w:r>
         <w:rPr>
           <w:rFonts w:ascii="Symbol" w:hAnsi="Symbol" w:eastAsia="Symbol"/>
@@ -14326,7 +14230,6 @@
           <w:color w:val="000000"/>
           <w:sz w:val="28"/>
         </w:rPr>
-        <w:t></w:t>
       </w:r>
       <w:r>
         <w:rPr>
@@ -14336,7 +14239,6 @@
           <w:color w:val="000000"/>
           <w:sz w:val="28"/>
         </w:rPr>
-        <w:t xml:space="preserve"> does not know the subject. </w:t>
       </w:r>
     </w:p>
     <w:p>
@@ -14588,7 +14490,7 @@
                 <w:color w:val="000000"/>
                 <w:sz w:val="28"/>
               </w:rPr>
-              <w:t xml:space="preserve">Nigmatov A.N. Theoretical Foundations of Ecology. </w:t>
+              <w:t>Nigmatov A.N. Theoretical Foundations of Ecology. Darslik. – Toshkent, National Society of Philosophers of Uzbekistan Publishing House, 2013. — 268 p.</w:t>
             </w:r>
             <w:r>
               <w:rPr>
@@ -14598,7 +14500,6 @@
                 <w:color w:val="000000"/>
                 <w:sz w:val="28"/>
               </w:rPr>
-              <w:t xml:space="preserve">Textbook. – Tashkent, National Society of Philosophers </w:t>
             </w:r>
             <w:r>
               <w:rPr>
@@ -14608,7 +14509,6 @@
                 <w:color w:val="000000"/>
                 <w:sz w:val="28"/>
               </w:rPr>
-              <w:t xml:space="preserve">of Uzbekistan Publishing House, 2013. — 268 p. </w:t>
             </w:r>
           </w:p>
         </w:tc>
@@ -14683,7 +14583,7 @@
                 <w:color w:val="000000"/>
                 <w:sz w:val="28"/>
               </w:rPr>
-              <w:t xml:space="preserve">Ayubova I.X., Safayev U.A. Ecology. Textbook. – </w:t>
+              <w:t>Ayubova I.X., Safayev U.A. Ecology. Darslik. – Toshkent, TSTU Publishing House, 2023. — 240 p.</w:t>
             </w:r>
             <w:r>
               <w:rPr>
@@ -14693,7 +14593,6 @@
                 <w:color w:val="000000"/>
                 <w:sz w:val="28"/>
               </w:rPr>
-              <w:t xml:space="preserve">Tashkent, TSTU Publishing House, 2023. — 240 p. </w:t>
             </w:r>
           </w:p>
         </w:tc>
@@ -14768,7 +14667,7 @@
                 <w:color w:val="000000"/>
                 <w:sz w:val="28"/>
               </w:rPr>
-              <w:t xml:space="preserve">Ibragimov N.I. et al. Ecology. Study guide. – Tashkent, </w:t>
+              <w:t>Ibragimov N.I. et al. Ecology. O'quv qo'llanma. – Toshkent, TSTU Publishing House, 2007. — 110 p.</w:t>
             </w:r>
             <w:r>
               <w:rPr>
@@ -14778,7 +14677,6 @@
                 <w:color w:val="000000"/>
                 <w:sz w:val="28"/>
               </w:rPr>
-              <w:t xml:space="preserve">TSTU Publishing House, 2007. — 110 p. </w:t>
             </w:r>
           </w:p>
         </w:tc>
@@ -14853,7 +14751,7 @@
                 <w:color w:val="000000"/>
                 <w:sz w:val="28"/>
               </w:rPr>
-              <w:t xml:space="preserve">Buriyev S.S. Ecology and Environmental Protection. </w:t>
+              <w:t>Buriyev S.S. Ecology and Environmental Protection. O'quv qo'llanma. – Toshkent, Toshkent Publishing House, 2019. — 240 p.</w:t>
             </w:r>
             <w:r>
               <w:rPr>
@@ -14863,7 +14761,6 @@
                 <w:color w:val="000000"/>
                 <w:sz w:val="28"/>
               </w:rPr>
-              <w:t xml:space="preserve">Study guide. – Tashkent, Tashkent Publishing House, </w:t>
             </w:r>
             <w:r>
               <w:rPr>
@@ -14873,7 +14770,6 @@
                 <w:color w:val="000000"/>
                 <w:sz w:val="28"/>
               </w:rPr>
-              <w:t xml:space="preserve">2019. — 240 p. </w:t>
             </w:r>
           </w:p>
         </w:tc>
@@ -15057,11 +14953,11 @@
                 <w:color w:val="000000"/>
                 <w:sz w:val="28"/>
               </w:rPr>
-              <w:t xml:space="preserve">Qudratov O. Industrial Ecology. Study guide. – </w:t>
-            </w:r>
-            <w:r>
+              <w:t xml:space="preserve">Qudratov O. Industrial Ecology. O'quv qo'llanma. – </w:t>
               <w:br/>
-            </w:r>
+              <w:t>Toshkent, Toshkent Publishing House, 2005. — 180 p.</w:t>
+            </w:r>
+            <w:r/>
             <w:r>
               <w:rPr>
                 <w:rFonts w:ascii="Arial" w:hAnsi="Arial" w:eastAsia="Arial"/>
@@ -15070,7 +14966,6 @@
                 <w:color w:val="000000"/>
                 <w:sz w:val="28"/>
               </w:rPr>
-              <w:t xml:space="preserve">Tashkent, Tashkent Publishing House, 2005. — 180 p. </w:t>
             </w:r>
           </w:p>
         </w:tc>
@@ -15145,7 +15040,7 @@
                 <w:color w:val="000000"/>
                 <w:sz w:val="28"/>
               </w:rPr>
-              <w:t xml:space="preserve">Otaboyev Sh., Malikov Z., Mamadaliyev Sh., Mirsovurov </w:t>
+              <w:t>Otaboyev Sh., Malikov Z., Mamadaliyev Sh., Mirsovurov M. Ecology. O'quv qo'llanma. – Toshkent, Chinor Publishing House, 2011. — 165 p.</w:t>
             </w:r>
             <w:r>
               <w:rPr>
@@ -15155,7 +15050,6 @@
                 <w:color w:val="000000"/>
                 <w:sz w:val="28"/>
               </w:rPr>
-              <w:t xml:space="preserve">M. Ecology. Study guide. – Tashkent, Chinor Publishing </w:t>
             </w:r>
             <w:r>
               <w:rPr>
@@ -15165,7 +15059,6 @@
                 <w:color w:val="000000"/>
                 <w:sz w:val="28"/>
               </w:rPr>
-              <w:t xml:space="preserve">House, 2011. — 165 p. </w:t>
             </w:r>
           </w:p>
         </w:tc>
@@ -15897,7 +15790,7 @@
           <w:color w:val="000000"/>
           <w:sz w:val="28"/>
         </w:rPr>
-        <w:t>“APPROVED”</w:t>
+        <w:t>"TASDIQLANGAN"</w:t>
       </w:r>
     </w:p>
     <w:p>
@@ -16195,7 +16088,7 @@
                 <w:color w:val="000000"/>
                 <w:sz w:val="28"/>
               </w:rPr>
-              <w:t xml:space="preserve">curriculum </w:t>
+              <w:t>o'quv dasturi</w:t>
             </w:r>
           </w:p>
         </w:tc>
@@ -16225,7 +16118,6 @@
                 <w:color w:val="000000"/>
                 <w:sz w:val="28"/>
               </w:rPr>
-              <w:t xml:space="preserve">has </w:t>
             </w:r>
           </w:p>
         </w:tc>
@@ -16255,7 +16147,6 @@
                 <w:color w:val="000000"/>
                 <w:sz w:val="28"/>
               </w:rPr>
-              <w:t xml:space="preserve">been </w:t>
             </w:r>
           </w:p>
         </w:tc>
@@ -16285,7 +16176,7 @@
                 <w:color w:val="000000"/>
                 <w:sz w:val="28"/>
               </w:rPr>
-              <w:t xml:space="preserve">presented </w:t>
+              <w:t>taqdim etilgan</w:t>
             </w:r>
           </w:p>
         </w:tc>
@@ -16315,7 +16206,6 @@
                 <w:color w:val="000000"/>
                 <w:sz w:val="28"/>
               </w:rPr>
-              <w:t xml:space="preserve">by </w:t>
             </w:r>
           </w:p>
         </w:tc>
@@ -16345,7 +16235,6 @@
                 <w:color w:val="000000"/>
                 <w:sz w:val="28"/>
               </w:rPr>
-              <w:t xml:space="preserve">the </w:t>
             </w:r>
           </w:p>
         </w:tc>
@@ -16375,7 +16264,7 @@
                 <w:color w:val="000000"/>
                 <w:sz w:val="28"/>
               </w:rPr>
-              <w:t xml:space="preserve">Department </w:t>
+              <w:t>kafedra</w:t>
             </w:r>
           </w:p>
         </w:tc>
@@ -16405,7 +16294,7 @@
                 <w:color w:val="000000"/>
                 <w:sz w:val="28"/>
               </w:rPr>
-              <w:t xml:space="preserve">of </w:t>
+              <w:t>tomonidan</w:t>
             </w:r>
           </w:p>
         </w:tc>
@@ -16428,7 +16317,7 @@
           <w:color w:val="000000"/>
           <w:sz w:val="28"/>
         </w:rPr>
-        <w:t xml:space="preserve">“______________” of ______________ (Minutes No. __ of the department </w:t>
+        <w:t>"______________" ______________ (kafedra yig'ilishining 20__-yil __ __________ dagi __-son bayonnomasi).</w:t>
       </w:r>
       <w:r>
         <w:rPr>
@@ -16438,7 +16327,6 @@
           <w:color w:val="000000"/>
           <w:sz w:val="28"/>
         </w:rPr>
-        <w:t xml:space="preserve">meeting dated __ __________ 20__). </w:t>
       </w:r>
     </w:p>
     <w:p>
@@ -16481,7 +16369,7 @@
           <w:color w:val="000000"/>
           <w:sz w:val="28"/>
         </w:rPr>
-        <w:t xml:space="preserve">______________ – ______________.  Full Name – academic degree, </w:t>
+        <w:t>______________ – ______________. F.I.Sh. – ilmiy daraja, unvon, kafedra nomi, lavozim.</w:t>
       </w:r>
       <w:r>
         <w:rPr>
@@ -16491,7 +16379,6 @@
           <w:color w:val="000000"/>
           <w:sz w:val="28"/>
         </w:rPr>
-        <w:t xml:space="preserve">title, name of department, position. </w:t>
       </w:r>
     </w:p>
     <w:p>
@@ -16514,7 +16401,7 @@
           <w:color w:val="000000"/>
           <w:sz w:val="28"/>
         </w:rPr>
-        <w:t xml:space="preserve">______________ – ______________.  Full Name – academic degree, </w:t>
+        <w:t>______________ – ______________. F.I.Sh. – ilmiy daraja, unvon, kafedra nomi, lavozim.</w:t>
       </w:r>
       <w:r>
         <w:rPr>
@@ -16524,7 +16411,6 @@
           <w:color w:val="000000"/>
           <w:sz w:val="28"/>
         </w:rPr>
-        <w:t xml:space="preserve">title, name of department, position. </w:t>
       </w:r>
     </w:p>
     <w:p>
@@ -16567,7 +16453,7 @@
           <w:color w:val="000000"/>
           <w:sz w:val="28"/>
         </w:rPr>
-        <w:t xml:space="preserve">______________ – ______________.  Full Name – academic degree, </w:t>
+        <w:t>______________ – ______________. F.I.Sh. – ilmiy daraja, unvon, kafedra nomi, lavozim.</w:t>
       </w:r>
       <w:r>
         <w:rPr>
@@ -16577,7 +16463,6 @@
           <w:color w:val="000000"/>
           <w:sz w:val="28"/>
         </w:rPr>
-        <w:t xml:space="preserve">title, name of department, position. </w:t>
       </w:r>
     </w:p>
     <w:p>
@@ -22114,7 +21999,7 @@
           <w:color w:val="000000"/>
           <w:sz w:val="28"/>
         </w:rPr>
-        <w:t xml:space="preserve">… </w:t>
+        <w:t>…</w:t>
       </w:r>
     </w:p>
     <w:tbl>

</xml_diff>

<commit_message>
Update Annex 4 translation (final refinement)
Co-Authored-By: Claude Opus 4.6 <noreply@anthropic.com>
Claude-Session: https://claude.ai/code/session_01N9ZP28hxEfPoWHf2qaE8QM
</commit_message>
<xml_diff>
--- a/Computer Engineering, Software Engineering, Computer systems & their softwares/Annexes/Annex №4 Curriculum Development Guidelines.docx
+++ b/Computer Engineering, Software Engineering, Computer systems & their softwares/Annexes/Annex №4 Curriculum Development Guidelines.docx
@@ -7512,7 +7512,7 @@
                 <w:color w:val="000000"/>
                 <w:sz w:val="28"/>
               </w:rPr>
-              <w:t xml:space="preserve">The state of the environment in Uzbekistan. [1,2] </w:t>
+              <w:t xml:space="preserve">O'zbekistonda atrof-muhit holati. [1,2] </w:t>
             </w:r>
           </w:p>
         </w:tc>
@@ -8921,7 +8921,7 @@
                 <w:color w:val="000000"/>
                 <w:sz w:val="28"/>
               </w:rPr>
-              <w:t xml:space="preserve">Insufficient provision of the population with drinking </w:t>
+              <w:t xml:space="preserve">Aholini ichimlik suv bilan yetarli ta'minlanmaganligi. Suv ta'minotini yaxshilash. Orol dengizi muammosi. </w:t>
             </w:r>
             <w:r>
               <w:rPr>
@@ -8931,7 +8931,6 @@
                 <w:color w:val="000000"/>
                 <w:sz w:val="28"/>
               </w:rPr>
-              <w:t xml:space="preserve">water. Improving water supply. The Aral Sea problem. </w:t>
             </w:r>
           </w:p>
           <w:p>
@@ -9108,7 +9107,7 @@
                 <w:color w:val="000000"/>
                 <w:sz w:val="28"/>
               </w:rPr>
-              <w:t xml:space="preserve">Wastewater treatment systems and facilities. [2,5,6] </w:t>
+              <w:t xml:space="preserve">Oqava suvlarni tozalash tizimlari va inshootlari. [2,5,6] </w:t>
             </w:r>
           </w:p>
         </w:tc>
@@ -9256,7 +9255,7 @@
                 <w:color w:val="000000"/>
                 <w:sz w:val="28"/>
               </w:rPr>
-              <w:t xml:space="preserve">Land degradation. [2,4,5] </w:t>
+              <w:t xml:space="preserve">Yer degradatsiyasi. [2,4,5] </w:t>
             </w:r>
           </w:p>
         </w:tc>
@@ -9661,7 +9660,7 @@
                 <w:color w:val="000000"/>
                 <w:sz w:val="28"/>
               </w:rPr>
-              <w:t xml:space="preserve">International environmental responsibility. [4,7] </w:t>
+              <w:t xml:space="preserve">Xalqaro ekologik javobgarlik. [4,7] </w:t>
             </w:r>
           </w:p>
         </w:tc>
@@ -14490,7 +14489,7 @@
                 <w:color w:val="000000"/>
                 <w:sz w:val="28"/>
               </w:rPr>
-              <w:t>Nigmatov A.N. Theoretical Foundations of Ecology. Darslik. – Toshkent, National Society of Philosophers of Uzbekistan Publishing House, 2013. — 268 p.</w:t>
+              <w:t>Nigmatov A.N. Ekologiyaning nazariy asoslari. Darslik. – Toshkent, O'zbekiston Falsafalar milliy jamiyati nashriyoti, 2013. — 268 b.</w:t>
             </w:r>
             <w:r>
               <w:rPr>
@@ -14583,7 +14582,7 @@
                 <w:color w:val="000000"/>
                 <w:sz w:val="28"/>
               </w:rPr>
-              <w:t>Ayubova I.X., Safayev U.A. Ecology. Darslik. – Toshkent, TSTU Publishing House, 2023. — 240 p.</w:t>
+              <w:t>Ayubova I.X., Safayev U.A. Ekologiya. Darslik. – Toshkent, TDTU nashriyoti, 2023. — 240 b.</w:t>
             </w:r>
             <w:r>
               <w:rPr>
@@ -14667,7 +14666,7 @@
                 <w:color w:val="000000"/>
                 <w:sz w:val="28"/>
               </w:rPr>
-              <w:t>Ibragimov N.I. et al. Ecology. O'quv qo'llanma. – Toshkent, TSTU Publishing House, 2007. — 110 p.</w:t>
+              <w:t>Ibragimov N.I. va boshq. Ekologiya. O'quv qo'llanma. – Toshkent, TDTU nashriyoti, 2007. — 110 b.</w:t>
             </w:r>
             <w:r>
               <w:rPr>
@@ -14751,7 +14750,7 @@
                 <w:color w:val="000000"/>
                 <w:sz w:val="28"/>
               </w:rPr>
-              <w:t>Buriyev S.S. Ecology and Environmental Protection. O'quv qo'llanma. – Toshkent, Toshkent Publishing House, 2019. — 240 p.</w:t>
+              <w:t>Buriyev S.S. Ekologiya va atrof-muhit muhofazasi. O'quv qo'llanma. – Toshkent, Toshkent nashriyoti, 2019. — 240 b.</w:t>
             </w:r>
             <w:r>
               <w:rPr>
@@ -14953,9 +14952,7 @@
                 <w:color w:val="000000"/>
                 <w:sz w:val="28"/>
               </w:rPr>
-              <w:t xml:space="preserve">Qudratov O. Industrial Ecology. O'quv qo'llanma. – </w:t>
-              <w:br/>
-              <w:t>Toshkent, Toshkent Publishing House, 2005. — 180 p.</w:t>
+              <w:t>Qudratov O. Sanoat ekologiyasi. O'quv qo'llanma. – Toshkent, Toshkent nashriyoti, 2005. — 180 b.</w:t>
             </w:r>
             <w:r/>
             <w:r>
@@ -15040,7 +15037,7 @@
                 <w:color w:val="000000"/>
                 <w:sz w:val="28"/>
               </w:rPr>
-              <w:t>Otaboyev Sh., Malikov Z., Mamadaliyev Sh., Mirsovurov M. Ecology. O'quv qo'llanma. – Toshkent, Chinor Publishing House, 2011. — 165 p.</w:t>
+              <w:t>Otaboyev Sh., Malikov Z., Mamadaliyev Sh., Mirsovurov M. Ekologiya. O'quv qo'llanma. – Toshkent, Chinor nashriyoti, 2011. — 165 b.</w:t>
             </w:r>
             <w:r>
               <w:rPr>
@@ -15133,7 +15130,9 @@
                 <w:color w:val="000000"/>
                 <w:sz w:val="28"/>
               </w:rPr>
-              <w:t xml:space="preserve">Tim Low. Climate Change &amp; Invasive Species. A </w:t>
+              <w:t>Tim Low. Climate Change &amp; Invasive Species. A Review of Interactions — 2006-yil noyabr seminar hisoboti.</w:t>
+              <w:br/>
+              <w:t>https://www.dcceew.gov.au/sites/default/files/documents/interactions-cc-invasive.pdf</w:t>
             </w:r>
             <w:r>
               <w:rPr>
@@ -15143,7 +15142,6 @@
                 <w:color w:val="000000"/>
                 <w:sz w:val="28"/>
               </w:rPr>
-              <w:t xml:space="preserve">Review of Interactions — November 2006 Workshop </w:t>
             </w:r>
             <w:r>
               <w:rPr>
@@ -15153,7 +15151,6 @@
                 <w:color w:val="000000"/>
                 <w:sz w:val="28"/>
               </w:rPr>
-              <w:t xml:space="preserve">Report. </w:t>
             </w:r>
           </w:p>
           <w:p>

</xml_diff>